<commit_message>
Whoah, old documentation bug was still here
git-svn-id: https://sources.ecopath.org/svn/Ecopath/trunk/Ecopath6@15427 a725721c-0ed6-864e-a6a8-02c2a1988c9d
</commit_message>
<xml_diff>
--- a/Documentation/Misc writeups/Discards/Discards changes 2017.docx
+++ b/Documentation/Misc writeups/Discards/Discards changes 2017.docx
@@ -1,6 +1,6 @@
 
 <file path=word/document.xml><?xml version="1.0" encoding="utf-8"?>
-<w:document xmlns:wpc="http://schemas.microsoft.com/office/word/2010/wordprocessingCanvas" xmlns:mc="http://schemas.openxmlformats.org/markup-compatibility/2006" xmlns:o="urn:schemas-microsoft-com:office:office" xmlns:r="http://schemas.openxmlformats.org/officeDocument/2006/relationships" xmlns:m="http://schemas.openxmlformats.org/officeDocument/2006/math" xmlns:v="urn:schemas-microsoft-com:vml" xmlns:wp14="http://schemas.microsoft.com/office/word/2010/wordprocessingDrawing" xmlns:wp="http://schemas.openxmlformats.org/drawingml/2006/wordprocessingDrawing" xmlns:w10="urn:schemas-microsoft-com:office:word" xmlns:w="http://schemas.openxmlformats.org/wordprocessingml/2006/main" xmlns:w14="http://schemas.microsoft.com/office/word/2010/wordml" xmlns:wpg="http://schemas.microsoft.com/office/word/2010/wordprocessingGroup" xmlns:wpi="http://schemas.microsoft.com/office/word/2010/wordprocessingInk" xmlns:wne="http://schemas.microsoft.com/office/word/2006/wordml" xmlns:wps="http://schemas.microsoft.com/office/word/2010/wordprocessingShape" mc:Ignorable="w14 wp14">
+<w:document xmlns:wpc="http://schemas.microsoft.com/office/word/2010/wordprocessingCanvas" xmlns:cx="http://schemas.microsoft.com/office/drawing/2014/chartex" xmlns:mc="http://schemas.openxmlformats.org/markup-compatibility/2006" xmlns:o="urn:schemas-microsoft-com:office:office" xmlns:r="http://schemas.openxmlformats.org/officeDocument/2006/relationships" xmlns:m="http://schemas.openxmlformats.org/officeDocument/2006/math" xmlns:v="urn:schemas-microsoft-com:vml" xmlns:wp14="http://schemas.microsoft.com/office/word/2010/wordprocessingDrawing" xmlns:wp="http://schemas.openxmlformats.org/drawingml/2006/wordprocessingDrawing" xmlns:w10="urn:schemas-microsoft-com:office:word" xmlns:w="http://schemas.openxmlformats.org/wordprocessingml/2006/main" xmlns:w14="http://schemas.microsoft.com/office/word/2010/wordml" xmlns:w15="http://schemas.microsoft.com/office/word/2012/wordml" xmlns:w16se="http://schemas.microsoft.com/office/word/2015/wordml/symex" xmlns:wpg="http://schemas.microsoft.com/office/word/2010/wordprocessingGroup" xmlns:wpi="http://schemas.microsoft.com/office/word/2010/wordprocessingInk" xmlns:wne="http://schemas.microsoft.com/office/word/2006/wordml" xmlns:wps="http://schemas.microsoft.com/office/word/2010/wordprocessingShape" mc:Ignorable="w14 w15 w16se wp14">
   <w:body>
     <w:p>
       <w:pPr>
@@ -38,7 +38,7 @@
                     <pic:cNvPicPr/>
                   </pic:nvPicPr>
                   <pic:blipFill>
-                    <a:blip r:embed="rId7" cstate="print">
+                    <a:blip r:embed="rId6" cstate="print">
                       <a:extLst>
                         <a:ext uri="{28A0092B-C50C-407E-A947-70E740481C1C}">
                           <a14:useLocalDpi xmlns:a14="http://schemas.microsoft.com/office/drawing/2010/main" val="0"/>
@@ -99,7 +99,7 @@
                     <pic:cNvPicPr/>
                   </pic:nvPicPr>
                   <pic:blipFill>
-                    <a:blip r:embed="rId8" cstate="print">
+                    <a:blip r:embed="rId7" cstate="print">
                       <a:extLst>
                         <a:ext uri="{28A0092B-C50C-407E-A947-70E740481C1C}">
                           <a14:useLocalDpi xmlns:a14="http://schemas.microsoft.com/office/drawing/2010/main" val="0"/>
@@ -161,40 +161,34 @@
       </w:r>
       <w:proofErr w:type="spellEnd"/>
       <w:r>
-        <w:t xml:space="preserve">, Villy Christensen, Mark </w:t>
+        <w:t xml:space="preserve">, </w:t>
       </w:r>
       <w:proofErr w:type="spellStart"/>
       <w:r>
-        <w:t>Platts</w:t>
+        <w:t>Villy</w:t>
       </w:r>
       <w:proofErr w:type="spellEnd"/>
       <w:r>
+        <w:t xml:space="preserve"> Christensen, Mark Platts, Jeroen Steenbeek</w:t>
+      </w:r>
+    </w:p>
+    <w:p>
+      <w:r>
+        <w:t>Document version 1.</w:t>
+      </w:r>
+      <w:r>
+        <w:t>2</w:t>
+      </w:r>
+      <w:r>
         <w:t xml:space="preserve">, </w:t>
       </w:r>
-      <w:proofErr w:type="spellStart"/>
-      <w:r>
-        <w:t>Jeroen</w:t>
-      </w:r>
-      <w:proofErr w:type="spellEnd"/>
-      <w:r>
-        <w:t xml:space="preserve"> Steenbeek</w:t>
-      </w:r>
-    </w:p>
-    <w:p>
-      <w:r>
-        <w:t>Document version 1.1</w:t>
-      </w:r>
-      <w:r>
-        <w:t xml:space="preserve">, 1 </w:t>
-      </w:r>
-      <w:r>
-        <w:t xml:space="preserve">March </w:t>
-      </w:r>
-      <w:r>
-        <w:t>2017</w:t>
+      <w:r>
+        <w:t>28 June 2018</w:t>
       </w:r>
       <w:r>
         <w:br/>
+      </w:r>
+      <w:r>
         <w:t>Software version 6.6, 1 March 2017</w:t>
       </w:r>
     </w:p>
@@ -265,12 +259,7 @@
         <w:t xml:space="preserve">output tables are </w:t>
       </w:r>
       <w:r>
-        <w:t xml:space="preserve">accessed via </w:t>
-      </w:r>
-      <w:bookmarkStart w:id="0" w:name="_GoBack"/>
-      <w:bookmarkEnd w:id="0"/>
-      <w:r>
-        <w:t>Navigator &gt; Ecopath &gt; Output &gt; Fishery</w:t>
+        <w:t>accessed via Navigator &gt; Ecopath &gt; Output &gt; Fishery</w:t>
       </w:r>
       <w:r>
         <w:t xml:space="preserve"> (</w:t>
@@ -331,7 +320,7 @@
                     </pic:cNvPicPr>
                   </pic:nvPicPr>
                   <pic:blipFill>
-                    <a:blip r:embed="rId9" cstate="print">
+                    <a:blip r:embed="rId8" cstate="print">
                       <a:extLst>
                         <a:ext uri="{28A0092B-C50C-407E-A947-70E740481C1C}">
                           <a14:useLocalDpi xmlns:a14="http://schemas.microsoft.com/office/drawing/2010/main" val="0"/>
@@ -372,32 +361,19 @@
           <w:lang w:eastAsia="en-GB"/>
         </w:rPr>
       </w:pPr>
-      <w:bookmarkStart w:id="1" w:name="_Ref475698021"/>
+      <w:bookmarkStart w:id="0" w:name="_Ref475698021"/>
       <w:r>
         <w:t xml:space="preserve">Figure </w:t>
       </w:r>
-      <w:r>
-        <w:fldChar w:fldCharType="begin"/>
-      </w:r>
-      <w:r>
-        <w:instrText xml:space="preserve"> SEQ Figure \* ARABIC </w:instrText>
-      </w:r>
-      <w:r>
-        <w:fldChar w:fldCharType="separate"/>
-      </w:r>
-      <w:r>
-        <w:rPr>
-          <w:noProof/>
-        </w:rPr>
-        <w:t>1</w:t>
-      </w:r>
-      <w:r>
-        <w:rPr>
-          <w:noProof/>
-        </w:rPr>
-        <w:fldChar w:fldCharType="end"/>
-      </w:r>
-      <w:bookmarkEnd w:id="1"/>
+      <w:fldSimple w:instr=" SEQ Figure \* ARABIC ">
+        <w:r>
+          <w:rPr>
+            <w:noProof/>
+          </w:rPr>
+          <w:t>1</w:t>
+        </w:r>
+      </w:fldSimple>
+      <w:bookmarkEnd w:id="0"/>
       <w:r>
         <w:t xml:space="preserve"> - </w:t>
       </w:r>
@@ -435,13 +411,8 @@
       <w:r>
         <w:t xml:space="preserve">aluing exported discard fate (representing the value of unwanted catch) is necessary to explicitly </w:t>
       </w:r>
-      <w:proofErr w:type="gramStart"/>
-      <w:r>
-        <w:t>represent</w:t>
-      </w:r>
-      <w:proofErr w:type="gramEnd"/>
-      <w:r>
-        <w:t xml:space="preserve"> </w:t>
+      <w:r>
+        <w:t xml:space="preserve">represent </w:t>
       </w:r>
       <w:r>
         <w:t>the implications of EU landings obligations</w:t>
@@ -681,7 +652,7 @@
                           </pic:cNvPicPr>
                         </pic:nvPicPr>
                         <pic:blipFill>
-                          <a:blip r:embed="rId10" cstate="print">
+                          <a:blip r:embed="rId9" cstate="print">
                             <a:extLst>
                               <a:ext uri="{28A0092B-C50C-407E-A947-70E740481C1C}">
                                 <a14:useLocalDpi xmlns:a14="http://schemas.microsoft.com/office/drawing/2010/main" val="0"/>
@@ -718,32 +689,19 @@
               <w:pStyle w:val="Caption"/>
               <w:framePr w:hSpace="181" w:wrap="notBeside" w:vAnchor="text" w:hAnchor="margin" w:xAlign="center" w:y="1"/>
             </w:pPr>
-            <w:bookmarkStart w:id="2" w:name="_Ref475698158"/>
+            <w:bookmarkStart w:id="1" w:name="_Ref475698158"/>
             <w:r>
               <w:t xml:space="preserve">Figure </w:t>
             </w:r>
-            <w:r>
-              <w:fldChar w:fldCharType="begin"/>
-            </w:r>
-            <w:r>
-              <w:instrText xml:space="preserve"> SEQ Figure \* ARABIC </w:instrText>
-            </w:r>
-            <w:r>
-              <w:fldChar w:fldCharType="separate"/>
-            </w:r>
-            <w:r>
-              <w:rPr>
-                <w:noProof/>
-              </w:rPr>
-              <w:t>2</w:t>
-            </w:r>
-            <w:r>
-              <w:rPr>
-                <w:noProof/>
-              </w:rPr>
-              <w:fldChar w:fldCharType="end"/>
-            </w:r>
-            <w:bookmarkEnd w:id="2"/>
+            <w:fldSimple w:instr=" SEQ Figure \* ARABIC ">
+              <w:r>
+                <w:rPr>
+                  <w:noProof/>
+                </w:rPr>
+                <w:t>2</w:t>
+              </w:r>
+            </w:fldSimple>
+            <w:bookmarkEnd w:id="1"/>
             <w:r>
               <w:t xml:space="preserve"> - New Ecosim </w:t>
             </w:r>
@@ -802,7 +760,7 @@
                           </pic:cNvPicPr>
                         </pic:nvPicPr>
                         <pic:blipFill>
-                          <a:blip r:embed="rId11" cstate="print">
+                          <a:blip r:embed="rId10" cstate="print">
                             <a:extLst>
                               <a:ext uri="{28A0092B-C50C-407E-A947-70E740481C1C}">
                                 <a14:useLocalDpi xmlns:a14="http://schemas.microsoft.com/office/drawing/2010/main" val="0"/>
@@ -839,32 +797,19 @@
               <w:pStyle w:val="Caption"/>
               <w:framePr w:hSpace="181" w:wrap="notBeside" w:vAnchor="text" w:hAnchor="margin" w:xAlign="center" w:y="1"/>
             </w:pPr>
-            <w:bookmarkStart w:id="3" w:name="_Ref475698173"/>
+            <w:bookmarkStart w:id="2" w:name="_Ref475698173"/>
             <w:r>
               <w:t xml:space="preserve">Figure </w:t>
             </w:r>
-            <w:r>
-              <w:fldChar w:fldCharType="begin"/>
-            </w:r>
-            <w:r>
-              <w:instrText xml:space="preserve"> SEQ Figure \* ARABIC </w:instrText>
-            </w:r>
-            <w:r>
-              <w:fldChar w:fldCharType="separate"/>
-            </w:r>
-            <w:r>
-              <w:rPr>
-                <w:noProof/>
-              </w:rPr>
-              <w:t>3</w:t>
-            </w:r>
-            <w:r>
-              <w:rPr>
-                <w:noProof/>
-              </w:rPr>
-              <w:fldChar w:fldCharType="end"/>
-            </w:r>
-            <w:bookmarkEnd w:id="3"/>
+            <w:fldSimple w:instr=" SEQ Figure \* ARABIC ">
+              <w:r>
+                <w:rPr>
+                  <w:noProof/>
+                </w:rPr>
+                <w:t>3</w:t>
+              </w:r>
+            </w:fldSimple>
+            <w:bookmarkEnd w:id="2"/>
             <w:r>
               <w:t xml:space="preserve"> - </w:t>
             </w:r>
@@ -1115,7 +1060,7 @@
                     <pic:cNvPicPr/>
                   </pic:nvPicPr>
                   <pic:blipFill>
-                    <a:blip r:embed="rId12"/>
+                    <a:blip r:embed="rId11"/>
                     <a:stretch>
                       <a:fillRect/>
                     </a:stretch>
@@ -1145,32 +1090,19 @@
           <w:lang w:eastAsia="en-GB"/>
         </w:rPr>
       </w:pPr>
-      <w:bookmarkStart w:id="4" w:name="_Ref475698982"/>
+      <w:bookmarkStart w:id="3" w:name="_Ref475698982"/>
       <w:r>
         <w:t xml:space="preserve">Figure </w:t>
       </w:r>
-      <w:r>
-        <w:fldChar w:fldCharType="begin"/>
-      </w:r>
-      <w:r>
-        <w:instrText xml:space="preserve"> SEQ Figure \* ARABIC </w:instrText>
-      </w:r>
-      <w:r>
-        <w:fldChar w:fldCharType="separate"/>
-      </w:r>
-      <w:r>
-        <w:rPr>
-          <w:noProof/>
-        </w:rPr>
-        <w:t>4</w:t>
-      </w:r>
-      <w:r>
-        <w:rPr>
-          <w:noProof/>
-        </w:rPr>
-        <w:fldChar w:fldCharType="end"/>
-      </w:r>
-      <w:bookmarkEnd w:id="4"/>
+      <w:fldSimple w:instr=" SEQ Figure \* ARABIC ">
+        <w:r>
+          <w:rPr>
+            <w:noProof/>
+          </w:rPr>
+          <w:t>4</w:t>
+        </w:r>
+      </w:fldSimple>
+      <w:bookmarkEnd w:id="3"/>
       <w:r>
         <w:t xml:space="preserve"> – Importing the new discards driver time series into Ecosim</w:t>
       </w:r>
@@ -1336,7 +1268,7 @@
                     <pic:cNvPicPr/>
                   </pic:nvPicPr>
                   <pic:blipFill>
-                    <a:blip r:embed="rId13"/>
+                    <a:blip r:embed="rId12"/>
                     <a:stretch>
                       <a:fillRect/>
                     </a:stretch>
@@ -1365,27 +1297,14 @@
       <w:r>
         <w:t xml:space="preserve">Figure </w:t>
       </w:r>
-      <w:r>
-        <w:fldChar w:fldCharType="begin"/>
-      </w:r>
-      <w:r>
-        <w:instrText xml:space="preserve"> SEQ Figure \* ARABIC </w:instrText>
-      </w:r>
-      <w:r>
-        <w:fldChar w:fldCharType="separate"/>
-      </w:r>
-      <w:r>
-        <w:rPr>
-          <w:noProof/>
-        </w:rPr>
-        <w:t>5</w:t>
-      </w:r>
-      <w:r>
-        <w:rPr>
-          <w:noProof/>
-        </w:rPr>
-        <w:fldChar w:fldCharType="end"/>
-      </w:r>
+      <w:fldSimple w:instr=" SEQ Figure \* ARABIC ">
+        <w:r>
+          <w:rPr>
+            <w:noProof/>
+          </w:rPr>
+          <w:t>5</w:t>
+        </w:r>
+      </w:fldSimple>
       <w:r>
         <w:t xml:space="preserve"> - Importing the new landings </w:t>
       </w:r>
@@ -1421,7 +1340,13 @@
         <w:t xml:space="preserve">The </w:t>
       </w:r>
       <w:r>
-        <w:t>Landings time series (type 13)</w:t>
+        <w:t>Landings time series (type 1</w:t>
+      </w:r>
+      <w:r>
+        <w:t>2</w:t>
+      </w:r>
+      <w:r>
+        <w:t>)</w:t>
       </w:r>
       <w:r>
         <w:t xml:space="preserve"> </w:t>
@@ -1435,7 +1360,15 @@
     </w:p>
     <w:p>
       <w:r>
-        <w:t xml:space="preserve">The Discards time series (type 14) </w:t>
+        <w:t>The Discards time series (type 1</w:t>
+      </w:r>
+      <w:r>
+        <w:t>3</w:t>
+      </w:r>
+      <w:bookmarkStart w:id="4" w:name="_GoBack"/>
+      <w:bookmarkEnd w:id="4"/>
+      <w:r>
+        <w:t xml:space="preserve">) </w:t>
       </w:r>
       <w:r>
         <w:t xml:space="preserve">is a reference time series </w:t>
@@ -1707,7 +1640,7 @@
                           </pic:cNvPicPr>
                         </pic:nvPicPr>
                         <pic:blipFill>
-                          <a:blip r:embed="rId14" cstate="print">
+                          <a:blip r:embed="rId13" cstate="print">
                             <a:extLst>
                               <a:ext uri="{28A0092B-C50C-407E-A947-70E740481C1C}">
                                 <a14:useLocalDpi xmlns:a14="http://schemas.microsoft.com/office/drawing/2010/main" val="0"/>
@@ -1751,27 +1684,14 @@
             <w:r>
               <w:t xml:space="preserve">Figure </w:t>
             </w:r>
-            <w:r>
-              <w:fldChar w:fldCharType="begin"/>
-            </w:r>
-            <w:r>
-              <w:instrText xml:space="preserve"> SEQ Figure \* ARABIC </w:instrText>
-            </w:r>
-            <w:r>
-              <w:fldChar w:fldCharType="separate"/>
-            </w:r>
-            <w:r>
-              <w:rPr>
-                <w:noProof/>
-              </w:rPr>
-              <w:t>6</w:t>
-            </w:r>
-            <w:r>
-              <w:rPr>
-                <w:noProof/>
-              </w:rPr>
-              <w:fldChar w:fldCharType="end"/>
-            </w:r>
+            <w:fldSimple w:instr=" SEQ Figure \* ARABIC ">
+              <w:r>
+                <w:rPr>
+                  <w:noProof/>
+                </w:rPr>
+                <w:t>6</w:t>
+              </w:r>
+            </w:fldSimple>
             <w:bookmarkEnd w:id="5"/>
             <w:r>
               <w:t xml:space="preserve"> - Enabling Ecosim discard forcing in Ecospace</w:t>
@@ -1815,7 +1735,7 @@
                           </pic:cNvPicPr>
                         </pic:nvPicPr>
                         <pic:blipFill>
-                          <a:blip r:embed="rId15" cstate="print">
+                          <a:blip r:embed="rId14" cstate="print">
                             <a:extLst>
                               <a:ext uri="{28A0092B-C50C-407E-A947-70E740481C1C}">
                                 <a14:useLocalDpi xmlns:a14="http://schemas.microsoft.com/office/drawing/2010/main" val="0"/>
@@ -1855,27 +1775,14 @@
             <w:r>
               <w:t xml:space="preserve">Figure </w:t>
             </w:r>
-            <w:r>
-              <w:fldChar w:fldCharType="begin"/>
-            </w:r>
-            <w:r>
-              <w:instrText xml:space="preserve"> SEQ Figure \* ARABIC </w:instrText>
-            </w:r>
-            <w:r>
-              <w:fldChar w:fldCharType="separate"/>
-            </w:r>
-            <w:r>
-              <w:rPr>
-                <w:noProof/>
-              </w:rPr>
-              <w:t>7</w:t>
-            </w:r>
-            <w:r>
-              <w:rPr>
-                <w:noProof/>
-              </w:rPr>
-              <w:fldChar w:fldCharType="end"/>
-            </w:r>
+            <w:fldSimple w:instr=" SEQ Figure \* ARABIC ">
+              <w:r>
+                <w:rPr>
+                  <w:noProof/>
+                </w:rPr>
+                <w:t>7</w:t>
+              </w:r>
+            </w:fldSimple>
             <w:bookmarkEnd w:id="6"/>
             <w:r>
               <w:t xml:space="preserve"> - Enabling automatic Ecospace discard map saving</w:t>
@@ -1914,7 +1821,7 @@
                     </pic:cNvPicPr>
                   </pic:nvPicPr>
                   <pic:blipFill>
-                    <a:blip r:embed="rId16" cstate="print">
+                    <a:blip r:embed="rId15" cstate="print">
                       <a:extLst>
                         <a:ext uri="{28A0092B-C50C-407E-A947-70E740481C1C}">
                           <a14:useLocalDpi xmlns:a14="http://schemas.microsoft.com/office/drawing/2010/main" val="0"/>
@@ -1959,38 +1866,17 @@
       <w:r>
         <w:t xml:space="preserve">Figure </w:t>
       </w:r>
-      <w:r>
-        <w:fldChar w:fldCharType="begin"/>
-      </w:r>
-      <w:r>
-        <w:instrText xml:space="preserve"> SEQ Figure \* ARABIC </w:instrText>
-      </w:r>
-      <w:r>
-        <w:fldChar w:fldCharType="separate"/>
-      </w:r>
-      <w:r>
-        <w:rPr>
-          <w:noProof/>
-        </w:rPr>
-        <w:t>8</w:t>
-      </w:r>
-      <w:r>
-        <w:rPr>
-          <w:noProof/>
-        </w:rPr>
-        <w:fldChar w:fldCharType="end"/>
-      </w:r>
+      <w:fldSimple w:instr=" SEQ Figure \* ARABIC ">
+        <w:r>
+          <w:rPr>
+            <w:noProof/>
+          </w:rPr>
+          <w:t>8</w:t>
+        </w:r>
+      </w:fldSimple>
       <w:bookmarkEnd w:id="7"/>
       <w:r>
-        <w:t xml:space="preserve"> – The warning that either MSE routine will display when running </w:t>
-      </w:r>
-      <w:proofErr w:type="gramStart"/>
-      <w:r>
-        <w:t>with  discards</w:t>
-      </w:r>
-      <w:proofErr w:type="gramEnd"/>
-      <w:r>
-        <w:t xml:space="preserve"> time series </w:t>
+        <w:t xml:space="preserve"> – The warning that either MSE routine will display when running with  discards time series </w:t>
       </w:r>
     </w:p>
     <w:p>
@@ -2131,8 +2017,8 @@
 </file>
 
 <file path=word/numbering.xml><?xml version="1.0" encoding="utf-8"?>
-<w:numbering xmlns:wpc="http://schemas.microsoft.com/office/word/2010/wordprocessingCanvas" xmlns:mc="http://schemas.openxmlformats.org/markup-compatibility/2006" xmlns:o="urn:schemas-microsoft-com:office:office" xmlns:r="http://schemas.openxmlformats.org/officeDocument/2006/relationships" xmlns:m="http://schemas.openxmlformats.org/officeDocument/2006/math" xmlns:v="urn:schemas-microsoft-com:vml" xmlns:wp14="http://schemas.microsoft.com/office/word/2010/wordprocessingDrawing" xmlns:wp="http://schemas.openxmlformats.org/drawingml/2006/wordprocessingDrawing" xmlns:w10="urn:schemas-microsoft-com:office:word" xmlns:w="http://schemas.openxmlformats.org/wordprocessingml/2006/main" xmlns:w14="http://schemas.microsoft.com/office/word/2010/wordml" xmlns:wpg="http://schemas.microsoft.com/office/word/2010/wordprocessingGroup" xmlns:wpi="http://schemas.microsoft.com/office/word/2010/wordprocessingInk" xmlns:wne="http://schemas.microsoft.com/office/word/2006/wordml" xmlns:wps="http://schemas.microsoft.com/office/word/2010/wordprocessingShape" mc:Ignorable="w14 wp14">
-  <w:abstractNum w:abstractNumId="0">
+<w:numbering xmlns:wpc="http://schemas.microsoft.com/office/word/2010/wordprocessingCanvas" xmlns:cx="http://schemas.microsoft.com/office/drawing/2014/chartex" xmlns:mc="http://schemas.openxmlformats.org/markup-compatibility/2006" xmlns:o="urn:schemas-microsoft-com:office:office" xmlns:r="http://schemas.openxmlformats.org/officeDocument/2006/relationships" xmlns:m="http://schemas.openxmlformats.org/officeDocument/2006/math" xmlns:v="urn:schemas-microsoft-com:vml" xmlns:wp14="http://schemas.microsoft.com/office/word/2010/wordprocessingDrawing" xmlns:wp="http://schemas.openxmlformats.org/drawingml/2006/wordprocessingDrawing" xmlns:w10="urn:schemas-microsoft-com:office:word" xmlns:w="http://schemas.openxmlformats.org/wordprocessingml/2006/main" xmlns:w14="http://schemas.microsoft.com/office/word/2010/wordml" xmlns:w15="http://schemas.microsoft.com/office/word/2012/wordml" xmlns:w16se="http://schemas.microsoft.com/office/word/2015/wordml/symex" xmlns:wpg="http://schemas.microsoft.com/office/word/2010/wordprocessingGroup" xmlns:wpi="http://schemas.microsoft.com/office/word/2010/wordprocessingInk" xmlns:wne="http://schemas.microsoft.com/office/word/2006/wordml" xmlns:wps="http://schemas.microsoft.com/office/word/2010/wordprocessingShape" mc:Ignorable="w14 w15 w16se wp14">
+  <w:abstractNum w:abstractNumId="0" w15:restartNumberingAfterBreak="0">
     <w:nsid w:val="7C5D4E22"/>
     <w:multiLevelType w:val="hybridMultilevel"/>
     <w:tmpl w:val="637E33EE"/>
@@ -2225,7 +2111,7 @@
 </file>
 
 <file path=word/styles.xml><?xml version="1.0" encoding="utf-8"?>
-<w:styles xmlns:mc="http://schemas.openxmlformats.org/markup-compatibility/2006" xmlns:r="http://schemas.openxmlformats.org/officeDocument/2006/relationships" xmlns:w="http://schemas.openxmlformats.org/wordprocessingml/2006/main" xmlns:w14="http://schemas.microsoft.com/office/word/2010/wordml" mc:Ignorable="w14">
+<w:styles xmlns:mc="http://schemas.openxmlformats.org/markup-compatibility/2006" xmlns:r="http://schemas.openxmlformats.org/officeDocument/2006/relationships" xmlns:w="http://schemas.openxmlformats.org/wordprocessingml/2006/main" xmlns:w14="http://schemas.microsoft.com/office/word/2010/wordml" xmlns:w15="http://schemas.microsoft.com/office/word/2012/wordml" xmlns:w16se="http://schemas.microsoft.com/office/word/2015/wordml/symex" mc:Ignorable="w14 w15 w16se">
   <w:docDefaults>
     <w:rPrDefault>
       <w:rPr>
@@ -2241,559 +2127,378 @@
       </w:pPr>
     </w:pPrDefault>
   </w:docDefaults>
-  <w:latentStyles w:defLockedState="0" w:defUIPriority="99" w:defSemiHidden="1" w:defUnhideWhenUsed="1" w:defQFormat="0" w:count="267">
-    <w:lsdException w:name="Normal" w:semiHidden="0" w:uiPriority="0" w:unhideWhenUsed="0" w:qFormat="1"/>
-    <w:lsdException w:name="heading 1" w:semiHidden="0" w:uiPriority="9" w:unhideWhenUsed="0" w:qFormat="1"/>
-    <w:lsdException w:name="heading 2" w:uiPriority="9" w:qFormat="1"/>
-    <w:lsdException w:name="heading 3" w:uiPriority="9" w:qFormat="1"/>
-    <w:lsdException w:name="heading 4" w:uiPriority="9" w:qFormat="1"/>
-    <w:lsdException w:name="heading 5" w:uiPriority="9" w:qFormat="1"/>
-    <w:lsdException w:name="heading 6" w:uiPriority="9" w:qFormat="1"/>
-    <w:lsdException w:name="heading 7" w:uiPriority="9" w:qFormat="1"/>
-    <w:lsdException w:name="heading 8" w:uiPriority="9" w:qFormat="1"/>
-    <w:lsdException w:name="heading 9" w:uiPriority="9" w:qFormat="1"/>
-    <w:lsdException w:name="toc 1" w:uiPriority="39"/>
-    <w:lsdException w:name="toc 2" w:uiPriority="39"/>
-    <w:lsdException w:name="toc 3" w:uiPriority="39"/>
-    <w:lsdException w:name="toc 4" w:uiPriority="39"/>
-    <w:lsdException w:name="toc 5" w:uiPriority="39"/>
-    <w:lsdException w:name="toc 6" w:uiPriority="39"/>
-    <w:lsdException w:name="toc 7" w:uiPriority="39"/>
-    <w:lsdException w:name="toc 8" w:uiPriority="39"/>
-    <w:lsdException w:name="toc 9" w:uiPriority="39"/>
-    <w:lsdException w:name="caption" w:uiPriority="35" w:qFormat="1"/>
-    <w:lsdException w:name="Title" w:semiHidden="0" w:uiPriority="10" w:unhideWhenUsed="0" w:qFormat="1"/>
-    <w:lsdException w:name="Default Paragraph Font" w:uiPriority="1"/>
-    <w:lsdException w:name="Subtitle" w:semiHidden="0" w:uiPriority="11" w:unhideWhenUsed="0" w:qFormat="1"/>
-    <w:lsdException w:name="Strong" w:semiHidden="0" w:uiPriority="22" w:unhideWhenUsed="0" w:qFormat="1"/>
-    <w:lsdException w:name="Emphasis" w:semiHidden="0" w:uiPriority="20" w:unhideWhenUsed="0" w:qFormat="1"/>
-    <w:lsdException w:name="Table Grid" w:semiHidden="0" w:uiPriority="59" w:unhideWhenUsed="0"/>
-    <w:lsdException w:name="Placeholder Text" w:unhideWhenUsed="0"/>
-    <w:lsdException w:name="No Spacing" w:semiHidden="0" w:uiPriority="1" w:unhideWhenUsed="0" w:qFormat="1"/>
-    <w:lsdException w:name="Light Shading" w:semiHidden="0" w:uiPriority="60" w:unhideWhenUsed="0"/>
-    <w:lsdException w:name="Light List" w:semiHidden="0" w:uiPriority="61" w:unhideWhenUsed="0"/>
-    <w:lsdException w:name="Light Grid" w:semiHidden="0" w:uiPriority="62" w:unhideWhenUsed="0"/>
-    <w:lsdException w:name="Medium Shading 1" w:semiHidden="0" w:uiPriority="63" w:unhideWhenUsed="0"/>
-    <w:lsdException w:name="Medium Shading 2" w:semiHidden="0" w:uiPriority="64" w:unhideWhenUsed="0"/>
-    <w:lsdException w:name="Medium List 1" w:semiHidden="0" w:uiPriority="65" w:unhideWhenUsed="0"/>
-    <w:lsdException w:name="Medium List 2" w:semiHidden="0" w:uiPriority="66" w:unhideWhenUsed="0"/>
-    <w:lsdException w:name="Medium Grid 1" w:semiHidden="0" w:uiPriority="67" w:unhideWhenUsed="0"/>
-    <w:lsdException w:name="Medium Grid 2" w:semiHidden="0" w:uiPriority="68" w:unhideWhenUsed="0"/>
-    <w:lsdException w:name="Medium Grid 3" w:semiHidden="0" w:uiPriority="69" w:unhideWhenUsed="0"/>
-    <w:lsdException w:name="Dark List" w:semiHidden="0" w:uiPriority="70" w:unhideWhenUsed="0"/>
-    <w:lsdException w:name="Colorful Shading" w:semiHidden="0" w:uiPriority="71" w:unhideWhenUsed="0"/>
-    <w:lsdException w:name="Colorful List" w:semiHidden="0" w:uiPriority="72" w:unhideWhenUsed="0"/>
-    <w:lsdException w:name="Colorful Grid" w:semiHidden="0" w:uiPriority="73" w:unhideWhenUsed="0"/>
-    <w:lsdException w:name="Light Shading Accent 1" w:semiHidden="0" w:uiPriority="60" w:unhideWhenUsed="0"/>
-    <w:lsdException w:name="Light List Accent 1" w:semiHidden="0" w:uiPriority="61" w:unhideWhenUsed="0"/>
-    <w:lsdException w:name="Light Grid Accent 1" w:semiHidden="0" w:uiPriority="62" w:unhideWhenUsed="0"/>
-    <w:lsdException w:name="Medium Shading 1 Accent 1" w:semiHidden="0" w:uiPriority="63" w:unhideWhenUsed="0"/>
-    <w:lsdException w:name="Medium Shading 2 Accent 1" w:semiHidden="0" w:uiPriority="64" w:unhideWhenUsed="0"/>
-    <w:lsdException w:name="Medium List 1 Accent 1" w:semiHidden="0" w:uiPriority="65" w:unhideWhenUsed="0"/>
-    <w:lsdException w:name="Revision" w:unhideWhenUsed="0"/>
-    <w:lsdException w:name="List Paragraph" w:semiHidden="0" w:uiPriority="34" w:unhideWhenUsed="0" w:qFormat="1"/>
-    <w:lsdException w:name="Quote" w:semiHidden="0" w:uiPriority="29" w:unhideWhenUsed="0" w:qFormat="1"/>
-    <w:lsdException w:name="Intense Quote" w:semiHidden="0" w:uiPriority="30" w:unhideWhenUsed="0" w:qFormat="1"/>
-    <w:lsdException w:name="Medium List 2 Accent 1" w:semiHidden="0" w:uiPriority="66" w:unhideWhenUsed="0"/>
-    <w:lsdException w:name="Medium Grid 1 Accent 1" w:semiHidden="0" w:uiPriority="67" w:unhideWhenUsed="0"/>
-    <w:lsdException w:name="Medium Grid 2 Accent 1" w:semiHidden="0" w:uiPriority="68" w:unhideWhenUsed="0"/>
-    <w:lsdException w:name="Medium Grid 3 Accent 1" w:semiHidden="0" w:uiPriority="69" w:unhideWhenUsed="0"/>
-    <w:lsdException w:name="Dark List Accent 1" w:semiHidden="0" w:uiPriority="70" w:unhideWhenUsed="0"/>
-    <w:lsdException w:name="Colorful Shading Accent 1" w:semiHidden="0" w:uiPriority="71" w:unhideWhenUsed="0"/>
-    <w:lsdException w:name="Colorful List Accent 1" w:semiHidden="0" w:uiPriority="72" w:unhideWhenUsed="0"/>
-    <w:lsdException w:name="Colorful Grid Accent 1" w:semiHidden="0" w:uiPriority="73" w:unhideWhenUsed="0"/>
-    <w:lsdException w:name="Light Shading Accent 2" w:semiHidden="0" w:uiPriority="60" w:unhideWhenUsed="0"/>
-    <w:lsdException w:name="Light List Accent 2" w:semiHidden="0" w:uiPriority="61" w:unhideWhenUsed="0"/>
-    <w:lsdException w:name="Light Grid Accent 2" w:semiHidden="0" w:uiPriority="62" w:unhideWhenUsed="0"/>
-    <w:lsdException w:name="Medium Shading 1 Accent 2" w:semiHidden="0" w:uiPriority="63" w:unhideWhenUsed="0"/>
-    <w:lsdException w:name="Medium Shading 2 Accent 2" w:semiHidden="0" w:uiPriority="64" w:unhideWhenUsed="0"/>
-    <w:lsdException w:name="Medium List 1 Accent 2" w:semiHidden="0" w:uiPriority="65" w:unhideWhenUsed="0"/>
-    <w:lsdException w:name="Medium List 2 Accent 2" w:semiHidden="0" w:uiPriority="66" w:unhideWhenUsed="0"/>
-    <w:lsdException w:name="Medium Grid 1 Accent 2" w:semiHidden="0" w:uiPriority="67" w:unhideWhenUsed="0"/>
-    <w:lsdException w:name="Medium Grid 2 Accent 2" w:semiHidden="0" w:uiPriority="68" w:unhideWhenUsed="0"/>
-    <w:lsdException w:name="Medium Grid 3 Accent 2" w:semiHidden="0" w:uiPriority="69" w:unhideWhenUsed="0"/>
-    <w:lsdException w:name="Dark List Accent 2" w:semiHidden="0" w:uiPriority="70" w:unhideWhenUsed="0"/>
-    <w:lsdException w:name="Colorful Shading Accent 2" w:semiHidden="0" w:uiPriority="71" w:unhideWhenUsed="0"/>
-    <w:lsdException w:name="Colorful List Accent 2" w:semiHidden="0" w:uiPriority="72" w:unhideWhenUsed="0"/>
-    <w:lsdException w:name="Colorful Grid Accent 2" w:semiHidden="0" w:uiPriority="73" w:unhideWhenUsed="0"/>
-    <w:lsdException w:name="Light Shading Accent 3" w:semiHidden="0" w:uiPriority="60" w:unhideWhenUsed="0"/>
-    <w:lsdException w:name="Light List Accent 3" w:semiHidden="0" w:uiPriority="61" w:unhideWhenUsed="0"/>
-    <w:lsdException w:name="Light Grid Accent 3" w:semiHidden="0" w:uiPriority="62" w:unhideWhenUsed="0"/>
-    <w:lsdException w:name="Medium Shading 1 Accent 3" w:semiHidden="0" w:uiPriority="63" w:unhideWhenUsed="0"/>
-    <w:lsdException w:name="Medium Shading 2 Accent 3" w:semiHidden="0" w:uiPriority="64" w:unhideWhenUsed="0"/>
-    <w:lsdException w:name="Medium List 1 Accent 3" w:semiHidden="0" w:uiPriority="65" w:unhideWhenUsed="0"/>
-    <w:lsdException w:name="Medium List 2 Accent 3" w:semiHidden="0" w:uiPriority="66" w:unhideWhenUsed="0"/>
-    <w:lsdException w:name="Medium Grid 1 Accent 3" w:semiHidden="0" w:uiPriority="67" w:unhideWhenUsed="0"/>
-    <w:lsdException w:name="Medium Grid 2 Accent 3" w:semiHidden="0" w:uiPriority="68" w:unhideWhenUsed="0"/>
-    <w:lsdException w:name="Medium Grid 3 Accent 3" w:semiHidden="0" w:uiPriority="69" w:unhideWhenUsed="0"/>
-    <w:lsdException w:name="Dark List Accent 3" w:semiHidden="0" w:uiPriority="70" w:unhideWhenUsed="0"/>
-    <w:lsdException w:name="Colorful Shading Accent 3" w:semiHidden="0" w:uiPriority="71" w:unhideWhenUsed="0"/>
-    <w:lsdException w:name="Colorful List Accent 3" w:semiHidden="0" w:uiPriority="72" w:unhideWhenUsed="0"/>
-    <w:lsdException w:name="Colorful Grid Accent 3" w:semiHidden="0" w:uiPriority="73" w:unhideWhenUsed="0"/>
-    <w:lsdException w:name="Light Shading Accent 4" w:semiHidden="0" w:uiPriority="60" w:unhideWhenUsed="0"/>
-    <w:lsdException w:name="Light List Accent 4" w:semiHidden="0" w:uiPriority="61" w:unhideWhenUsed="0"/>
-    <w:lsdException w:name="Light Grid Accent 4" w:semiHidden="0" w:uiPriority="62" w:unhideWhenUsed="0"/>
-    <w:lsdException w:name="Medium Shading 1 Accent 4" w:semiHidden="0" w:uiPriority="63" w:unhideWhenUsed="0"/>
-    <w:lsdException w:name="Medium Shading 2 Accent 4" w:semiHidden="0" w:uiPriority="64" w:unhideWhenUsed="0"/>
-    <w:lsdException w:name="Medium List 1 Accent 4" w:semiHidden="0" w:uiPriority="65" w:unhideWhenUsed="0"/>
-    <w:lsdException w:name="Medium List 2 Accent 4" w:semiHidden="0" w:uiPriority="66" w:unhideWhenUsed="0"/>
-    <w:lsdException w:name="Medium Grid 1 Accent 4" w:semiHidden="0" w:uiPriority="67" w:unhideWhenUsed="0"/>
-    <w:lsdException w:name="Medium Grid 2 Accent 4" w:semiHidden="0" w:uiPriority="68" w:unhideWhenUsed="0"/>
-    <w:lsdException w:name="Medium Grid 3 Accent 4" w:semiHidden="0" w:uiPriority="69" w:unhideWhenUsed="0"/>
-    <w:lsdException w:name="Dark List Accent 4" w:semiHidden="0" w:uiPriority="70" w:unhideWhenUsed="0"/>
-    <w:lsdException w:name="Colorful Shading Accent 4" w:semiHidden="0" w:uiPriority="71" w:unhideWhenUsed="0"/>
-    <w:lsdException w:name="Colorful List Accent 4" w:semiHidden="0" w:uiPriority="72" w:unhideWhenUsed="0"/>
-    <w:lsdException w:name="Colorful Grid Accent 4" w:semiHidden="0" w:uiPriority="73" w:unhideWhenUsed="0"/>
-    <w:lsdException w:name="Light Shading Accent 5" w:semiHidden="0" w:uiPriority="60" w:unhideWhenUsed="0"/>
-    <w:lsdException w:name="Light List Accent 5" w:semiHidden="0" w:uiPriority="61" w:unhideWhenUsed="0"/>
-    <w:lsdException w:name="Light Grid Accent 5" w:semiHidden="0" w:uiPriority="62" w:unhideWhenUsed="0"/>
-    <w:lsdException w:name="Medium Shading 1 Accent 5" w:semiHidden="0" w:uiPriority="63" w:unhideWhenUsed="0"/>
-    <w:lsdException w:name="Medium Shading 2 Accent 5" w:semiHidden="0" w:uiPriority="64" w:unhideWhenUsed="0"/>
-    <w:lsdException w:name="Medium List 1 Accent 5" w:semiHidden="0" w:uiPriority="65" w:unhideWhenUsed="0"/>
-    <w:lsdException w:name="Medium List 2 Accent 5" w:semiHidden="0" w:uiPriority="66" w:unhideWhenUsed="0"/>
-    <w:lsdException w:name="Medium Grid 1 Accent 5" w:semiHidden="0" w:uiPriority="67" w:unhideWhenUsed="0"/>
-    <w:lsdException w:name="Medium Grid 2 Accent 5" w:semiHidden="0" w:uiPriority="68" w:unhideWhenUsed="0"/>
-    <w:lsdException w:name="Medium Grid 3 Accent 5" w:semiHidden="0" w:uiPriority="69" w:unhideWhenUsed="0"/>
-    <w:lsdException w:name="Dark List Accent 5" w:semiHidden="0" w:uiPriority="70" w:unhideWhenUsed="0"/>
-    <w:lsdException w:name="Colorful Shading Accent 5" w:semiHidden="0" w:uiPriority="71" w:unhideWhenUsed="0"/>
-    <w:lsdException w:name="Colorful List Accent 5" w:semiHidden="0" w:uiPriority="72" w:unhideWhenUsed="0"/>
-    <w:lsdException w:name="Colorful Grid Accent 5" w:semiHidden="0" w:uiPriority="73" w:unhideWhenUsed="0"/>
-    <w:lsdException w:name="Light Shading Accent 6" w:semiHidden="0" w:uiPriority="60" w:unhideWhenUsed="0"/>
-    <w:lsdException w:name="Light List Accent 6" w:semiHidden="0" w:uiPriority="61" w:unhideWhenUsed="0"/>
-    <w:lsdException w:name="Light Grid Accent 6" w:semiHidden="0" w:uiPriority="62" w:unhideWhenUsed="0"/>
-    <w:lsdException w:name="Medium Shading 1 Accent 6" w:semiHidden="0" w:uiPriority="63" w:unhideWhenUsed="0"/>
-    <w:lsdException w:name="Medium Shading 2 Accent 6" w:semiHidden="0" w:uiPriority="64" w:unhideWhenUsed="0"/>
-    <w:lsdException w:name="Medium List 1 Accent 6" w:semiHidden="0" w:uiPriority="65" w:unhideWhenUsed="0"/>
-    <w:lsdException w:name="Medium List 2 Accent 6" w:semiHidden="0" w:uiPriority="66" w:unhideWhenUsed="0"/>
-    <w:lsdException w:name="Medium Grid 1 Accent 6" w:semiHidden="0" w:uiPriority="67" w:unhideWhenUsed="0"/>
-    <w:lsdException w:name="Medium Grid 2 Accent 6" w:semiHidden="0" w:uiPriority="68" w:unhideWhenUsed="0"/>
-    <w:lsdException w:name="Medium Grid 3 Accent 6" w:semiHidden="0" w:uiPriority="69" w:unhideWhenUsed="0"/>
-    <w:lsdException w:name="Dark List Accent 6" w:semiHidden="0" w:uiPriority="70" w:unhideWhenUsed="0"/>
-    <w:lsdException w:name="Colorful Shading Accent 6" w:semiHidden="0" w:uiPriority="71" w:unhideWhenUsed="0"/>
-    <w:lsdException w:name="Colorful List Accent 6" w:semiHidden="0" w:uiPriority="72" w:unhideWhenUsed="0"/>
-    <w:lsdException w:name="Colorful Grid Accent 6" w:semiHidden="0" w:uiPriority="73" w:unhideWhenUsed="0"/>
-    <w:lsdException w:name="Subtle Emphasis" w:semiHidden="0" w:uiPriority="19" w:unhideWhenUsed="0" w:qFormat="1"/>
-    <w:lsdException w:name="Intense Emphasis" w:semiHidden="0" w:uiPriority="21" w:unhideWhenUsed="0" w:qFormat="1"/>
-    <w:lsdException w:name="Subtle Reference" w:semiHidden="0" w:uiPriority="31" w:unhideWhenUsed="0" w:qFormat="1"/>
-    <w:lsdException w:name="Intense Reference" w:semiHidden="0" w:uiPriority="32" w:unhideWhenUsed="0" w:qFormat="1"/>
-    <w:lsdException w:name="Book Title" w:semiHidden="0" w:uiPriority="33" w:unhideWhenUsed="0" w:qFormat="1"/>
-    <w:lsdException w:name="Bibliography" w:uiPriority="37"/>
-    <w:lsdException w:name="TOC Heading" w:uiPriority="39" w:qFormat="1"/>
-  </w:latentStyles>
-  <w:style w:type="paragraph" w:default="1" w:styleId="Normal">
-    <w:name w:val="Normal"/>
-    <w:qFormat/>
-  </w:style>
-  <w:style w:type="paragraph" w:styleId="Heading1">
-    <w:name w:val="heading 1"/>
-    <w:basedOn w:val="Normal"/>
-    <w:next w:val="Normal"/>
-    <w:link w:val="Heading1Char"/>
-    <w:uiPriority w:val="9"/>
-    <w:qFormat/>
-    <w:rsid w:val="0022426C"/>
-    <w:pPr>
-      <w:keepNext/>
-      <w:keepLines/>
-      <w:spacing w:before="480" w:after="0"/>
-      <w:outlineLvl w:val="0"/>
-    </w:pPr>
-    <w:rPr>
-      <w:rFonts w:eastAsiaTheme="majorEastAsia" w:cstheme="majorBidi"/>
-      <w:b/>
-      <w:bCs/>
-      <w:sz w:val="28"/>
-      <w:szCs w:val="28"/>
-    </w:rPr>
-  </w:style>
-  <w:style w:type="paragraph" w:styleId="Heading2">
-    <w:name w:val="heading 2"/>
-    <w:basedOn w:val="Normal"/>
-    <w:next w:val="Normal"/>
-    <w:link w:val="Heading2Char"/>
-    <w:uiPriority w:val="9"/>
-    <w:unhideWhenUsed/>
-    <w:qFormat/>
-    <w:rsid w:val="0022426C"/>
-    <w:pPr>
-      <w:keepNext/>
-      <w:keepLines/>
-      <w:spacing w:before="200" w:after="0"/>
-      <w:outlineLvl w:val="1"/>
-    </w:pPr>
-    <w:rPr>
-      <w:rFonts w:eastAsiaTheme="majorEastAsia" w:cstheme="majorBidi"/>
-      <w:b/>
-      <w:bCs/>
-      <w:sz w:val="26"/>
-      <w:szCs w:val="26"/>
-    </w:rPr>
-  </w:style>
-  <w:style w:type="paragraph" w:styleId="Heading3">
-    <w:name w:val="heading 3"/>
-    <w:basedOn w:val="Normal"/>
-    <w:next w:val="Normal"/>
-    <w:link w:val="Heading3Char"/>
-    <w:uiPriority w:val="9"/>
-    <w:unhideWhenUsed/>
-    <w:qFormat/>
-    <w:rsid w:val="00E313FD"/>
-    <w:pPr>
-      <w:keepNext/>
-      <w:keepLines/>
-      <w:spacing w:before="200" w:after="0"/>
-      <w:outlineLvl w:val="2"/>
-    </w:pPr>
-    <w:rPr>
-      <w:rFonts w:asciiTheme="majorHAnsi" w:eastAsiaTheme="majorEastAsia" w:hAnsiTheme="majorHAnsi" w:cstheme="majorBidi"/>
-      <w:b/>
-      <w:bCs/>
-      <w:color w:val="4F81BD" w:themeColor="accent1"/>
-    </w:rPr>
-  </w:style>
-  <w:style w:type="character" w:default="1" w:styleId="DefaultParagraphFont">
-    <w:name w:val="Default Paragraph Font"/>
-    <w:uiPriority w:val="1"/>
-    <w:semiHidden/>
-    <w:unhideWhenUsed/>
-  </w:style>
-  <w:style w:type="table" w:default="1" w:styleId="TableNormal">
-    <w:name w:val="Normal Table"/>
-    <w:uiPriority w:val="99"/>
-    <w:semiHidden/>
-    <w:unhideWhenUsed/>
-    <w:tblPr>
-      <w:tblInd w:w="0" w:type="dxa"/>
-      <w:tblCellMar>
-        <w:top w:w="0" w:type="dxa"/>
-        <w:left w:w="108" w:type="dxa"/>
-        <w:bottom w:w="0" w:type="dxa"/>
-        <w:right w:w="108" w:type="dxa"/>
-      </w:tblCellMar>
-    </w:tblPr>
-  </w:style>
-  <w:style w:type="numbering" w:default="1" w:styleId="NoList">
-    <w:name w:val="No List"/>
-    <w:uiPriority w:val="99"/>
-    <w:semiHidden/>
-    <w:unhideWhenUsed/>
-  </w:style>
-  <w:style w:type="character" w:customStyle="1" w:styleId="Heading1Char">
-    <w:name w:val="Heading 1 Char"/>
-    <w:basedOn w:val="DefaultParagraphFont"/>
-    <w:link w:val="Heading1"/>
-    <w:uiPriority w:val="9"/>
-    <w:rsid w:val="0022426C"/>
-    <w:rPr>
-      <w:rFonts w:eastAsiaTheme="majorEastAsia" w:cstheme="majorBidi"/>
-      <w:b/>
-      <w:bCs/>
-      <w:sz w:val="28"/>
-      <w:szCs w:val="28"/>
-    </w:rPr>
-  </w:style>
-  <w:style w:type="character" w:customStyle="1" w:styleId="Heading2Char">
-    <w:name w:val="Heading 2 Char"/>
-    <w:basedOn w:val="DefaultParagraphFont"/>
-    <w:link w:val="Heading2"/>
-    <w:uiPriority w:val="9"/>
-    <w:rsid w:val="0022426C"/>
-    <w:rPr>
-      <w:rFonts w:eastAsiaTheme="majorEastAsia" w:cstheme="majorBidi"/>
-      <w:b/>
-      <w:bCs/>
-      <w:sz w:val="26"/>
-      <w:szCs w:val="26"/>
-    </w:rPr>
-  </w:style>
-  <w:style w:type="paragraph" w:styleId="BalloonText">
-    <w:name w:val="Balloon Text"/>
-    <w:basedOn w:val="Normal"/>
-    <w:link w:val="BalloonTextChar"/>
-    <w:uiPriority w:val="99"/>
-    <w:semiHidden/>
-    <w:unhideWhenUsed/>
-    <w:rsid w:val="00E313FD"/>
-    <w:pPr>
-      <w:spacing w:after="0" w:line="240" w:lineRule="auto"/>
-    </w:pPr>
-    <w:rPr>
-      <w:rFonts w:ascii="Tahoma" w:hAnsi="Tahoma" w:cs="Tahoma"/>
-      <w:sz w:val="16"/>
-      <w:szCs w:val="16"/>
-    </w:rPr>
-  </w:style>
-  <w:style w:type="character" w:customStyle="1" w:styleId="BalloonTextChar">
-    <w:name w:val="Balloon Text Char"/>
-    <w:basedOn w:val="DefaultParagraphFont"/>
-    <w:link w:val="BalloonText"/>
-    <w:uiPriority w:val="99"/>
-    <w:semiHidden/>
-    <w:rsid w:val="00E313FD"/>
-    <w:rPr>
-      <w:rFonts w:ascii="Tahoma" w:hAnsi="Tahoma" w:cs="Tahoma"/>
-      <w:sz w:val="16"/>
-      <w:szCs w:val="16"/>
-    </w:rPr>
-  </w:style>
-  <w:style w:type="character" w:customStyle="1" w:styleId="Heading3Char">
-    <w:name w:val="Heading 3 Char"/>
-    <w:basedOn w:val="DefaultParagraphFont"/>
-    <w:link w:val="Heading3"/>
-    <w:uiPriority w:val="9"/>
-    <w:rsid w:val="00E313FD"/>
-    <w:rPr>
-      <w:rFonts w:asciiTheme="majorHAnsi" w:eastAsiaTheme="majorEastAsia" w:hAnsiTheme="majorHAnsi" w:cstheme="majorBidi"/>
-      <w:b/>
-      <w:bCs/>
-      <w:color w:val="4F81BD" w:themeColor="accent1"/>
-    </w:rPr>
-  </w:style>
-  <w:style w:type="paragraph" w:styleId="Caption">
-    <w:name w:val="caption"/>
-    <w:basedOn w:val="Normal"/>
-    <w:next w:val="Normal"/>
-    <w:uiPriority w:val="35"/>
-    <w:unhideWhenUsed/>
-    <w:qFormat/>
-    <w:rsid w:val="0022426C"/>
-    <w:pPr>
-      <w:spacing w:line="240" w:lineRule="auto"/>
-    </w:pPr>
-    <w:rPr>
-      <w:b/>
-      <w:bCs/>
-      <w:sz w:val="18"/>
-      <w:szCs w:val="18"/>
-    </w:rPr>
-  </w:style>
-  <w:style w:type="table" w:styleId="TableGrid">
-    <w:name w:val="Table Grid"/>
-    <w:basedOn w:val="TableNormal"/>
-    <w:uiPriority w:val="59"/>
-    <w:rsid w:val="008C55C7"/>
-    <w:pPr>
-      <w:spacing w:after="0" w:line="240" w:lineRule="auto"/>
-    </w:pPr>
-    <w:tblPr>
-      <w:tblBorders>
-        <w:top w:val="single" w:sz="4" w:space="0" w:color="auto"/>
-        <w:left w:val="single" w:sz="4" w:space="0" w:color="auto"/>
-        <w:bottom w:val="single" w:sz="4" w:space="0" w:color="auto"/>
-        <w:right w:val="single" w:sz="4" w:space="0" w:color="auto"/>
-        <w:insideH w:val="single" w:sz="4" w:space="0" w:color="auto"/>
-        <w:insideV w:val="single" w:sz="4" w:space="0" w:color="auto"/>
-      </w:tblBorders>
-    </w:tblPr>
-  </w:style>
-  <w:style w:type="paragraph" w:styleId="Title">
-    <w:name w:val="Title"/>
-    <w:basedOn w:val="Normal"/>
-    <w:next w:val="Normal"/>
-    <w:link w:val="TitleChar"/>
-    <w:uiPriority w:val="10"/>
-    <w:qFormat/>
-    <w:rsid w:val="00380F0E"/>
-    <w:pPr>
-      <w:pBdr>
-        <w:bottom w:val="single" w:sz="8" w:space="4" w:color="1F497D" w:themeColor="text2"/>
-      </w:pBdr>
-      <w:shd w:val="clear" w:color="auto" w:fill="95B3D7" w:themeFill="accent1" w:themeFillTint="99"/>
-      <w:spacing w:after="300" w:line="240" w:lineRule="auto"/>
-      <w:contextualSpacing/>
-    </w:pPr>
-    <w:rPr>
-      <w:rFonts w:eastAsiaTheme="majorEastAsia" w:cstheme="majorBidi"/>
-      <w:spacing w:val="5"/>
-      <w:kern w:val="28"/>
-      <w:sz w:val="52"/>
-      <w:szCs w:val="52"/>
-    </w:rPr>
-  </w:style>
-  <w:style w:type="character" w:customStyle="1" w:styleId="TitleChar">
-    <w:name w:val="Title Char"/>
-    <w:basedOn w:val="DefaultParagraphFont"/>
-    <w:link w:val="Title"/>
-    <w:uiPriority w:val="10"/>
-    <w:rsid w:val="00380F0E"/>
-    <w:rPr>
-      <w:rFonts w:eastAsiaTheme="majorEastAsia" w:cstheme="majorBidi"/>
-      <w:spacing w:val="5"/>
-      <w:kern w:val="28"/>
-      <w:sz w:val="52"/>
-      <w:szCs w:val="52"/>
-      <w:shd w:val="clear" w:color="auto" w:fill="95B3D7" w:themeFill="accent1" w:themeFillTint="99"/>
-    </w:rPr>
-  </w:style>
-  <w:style w:type="paragraph" w:styleId="ListParagraph">
-    <w:name w:val="List Paragraph"/>
-    <w:basedOn w:val="Normal"/>
-    <w:uiPriority w:val="34"/>
-    <w:qFormat/>
-    <w:rsid w:val="00F67122"/>
-    <w:pPr>
-      <w:ind w:left="720"/>
-      <w:contextualSpacing/>
-    </w:pPr>
-  </w:style>
-</w:styles>
-</file>
-
-<file path=word/stylesWithEffects.xml><?xml version="1.0" encoding="utf-8"?>
-<w:styles xmlns:wpc="http://schemas.microsoft.com/office/word/2010/wordprocessingCanvas" xmlns:mc="http://schemas.openxmlformats.org/markup-compatibility/2006" xmlns:o="urn:schemas-microsoft-com:office:office" xmlns:r="http://schemas.openxmlformats.org/officeDocument/2006/relationships" xmlns:m="http://schemas.openxmlformats.org/officeDocument/2006/math" xmlns:v="urn:schemas-microsoft-com:vml" xmlns:wp14="http://schemas.microsoft.com/office/word/2010/wordprocessingDrawing" xmlns:wp="http://schemas.openxmlformats.org/drawingml/2006/wordprocessingDrawing" xmlns:w10="urn:schemas-microsoft-com:office:word" xmlns:w="http://schemas.openxmlformats.org/wordprocessingml/2006/main" xmlns:w14="http://schemas.microsoft.com/office/word/2010/wordml" xmlns:wpg="http://schemas.microsoft.com/office/word/2010/wordprocessingGroup" xmlns:wpi="http://schemas.microsoft.com/office/word/2010/wordprocessingInk" xmlns:wne="http://schemas.microsoft.com/office/word/2006/wordml" xmlns:wps="http://schemas.microsoft.com/office/word/2010/wordprocessingShape" mc:Ignorable="w14 wp14">
-  <w:docDefaults>
-    <w:rPrDefault>
-      <w:rPr>
-        <w:rFonts w:asciiTheme="minorHAnsi" w:eastAsiaTheme="minorHAnsi" w:hAnsiTheme="minorHAnsi" w:cstheme="minorBidi"/>
-        <w:sz w:val="22"/>
-        <w:szCs w:val="22"/>
-        <w:lang w:val="en-GB" w:eastAsia="en-US" w:bidi="ar-SA"/>
-      </w:rPr>
-    </w:rPrDefault>
-    <w:pPrDefault>
-      <w:pPr>
-        <w:spacing w:after="200" w:line="276" w:lineRule="auto"/>
-      </w:pPr>
-    </w:pPrDefault>
-  </w:docDefaults>
-  <w:latentStyles w:defLockedState="0" w:defUIPriority="99" w:defSemiHidden="1" w:defUnhideWhenUsed="1" w:defQFormat="0" w:count="267">
-    <w:lsdException w:name="Normal" w:semiHidden="0" w:uiPriority="0" w:unhideWhenUsed="0" w:qFormat="1"/>
-    <w:lsdException w:name="heading 1" w:semiHidden="0" w:uiPriority="9" w:unhideWhenUsed="0" w:qFormat="1"/>
-    <w:lsdException w:name="heading 2" w:uiPriority="9" w:qFormat="1"/>
-    <w:lsdException w:name="heading 3" w:uiPriority="9" w:qFormat="1"/>
-    <w:lsdException w:name="heading 4" w:uiPriority="9" w:qFormat="1"/>
-    <w:lsdException w:name="heading 5" w:uiPriority="9" w:qFormat="1"/>
-    <w:lsdException w:name="heading 6" w:uiPriority="9" w:qFormat="1"/>
-    <w:lsdException w:name="heading 7" w:uiPriority="9" w:qFormat="1"/>
-    <w:lsdException w:name="heading 8" w:uiPriority="9" w:qFormat="1"/>
-    <w:lsdException w:name="heading 9" w:uiPriority="9" w:qFormat="1"/>
-    <w:lsdException w:name="toc 1" w:uiPriority="39"/>
-    <w:lsdException w:name="toc 2" w:uiPriority="39"/>
-    <w:lsdException w:name="toc 3" w:uiPriority="39"/>
-    <w:lsdException w:name="toc 4" w:uiPriority="39"/>
-    <w:lsdException w:name="toc 5" w:uiPriority="39"/>
-    <w:lsdException w:name="toc 6" w:uiPriority="39"/>
-    <w:lsdException w:name="toc 7" w:uiPriority="39"/>
-    <w:lsdException w:name="toc 8" w:uiPriority="39"/>
-    <w:lsdException w:name="toc 9" w:uiPriority="39"/>
-    <w:lsdException w:name="caption" w:uiPriority="35" w:qFormat="1"/>
-    <w:lsdException w:name="Title" w:semiHidden="0" w:uiPriority="10" w:unhideWhenUsed="0" w:qFormat="1"/>
-    <w:lsdException w:name="Default Paragraph Font" w:uiPriority="1"/>
-    <w:lsdException w:name="Subtitle" w:semiHidden="0" w:uiPriority="11" w:unhideWhenUsed="0" w:qFormat="1"/>
-    <w:lsdException w:name="Strong" w:semiHidden="0" w:uiPriority="22" w:unhideWhenUsed="0" w:qFormat="1"/>
-    <w:lsdException w:name="Emphasis" w:semiHidden="0" w:uiPriority="20" w:unhideWhenUsed="0" w:qFormat="1"/>
-    <w:lsdException w:name="Table Grid" w:semiHidden="0" w:uiPriority="59" w:unhideWhenUsed="0"/>
-    <w:lsdException w:name="Placeholder Text" w:unhideWhenUsed="0"/>
-    <w:lsdException w:name="No Spacing" w:semiHidden="0" w:uiPriority="1" w:unhideWhenUsed="0" w:qFormat="1"/>
-    <w:lsdException w:name="Light Shading" w:semiHidden="0" w:uiPriority="60" w:unhideWhenUsed="0"/>
-    <w:lsdException w:name="Light List" w:semiHidden="0" w:uiPriority="61" w:unhideWhenUsed="0"/>
-    <w:lsdException w:name="Light Grid" w:semiHidden="0" w:uiPriority="62" w:unhideWhenUsed="0"/>
-    <w:lsdException w:name="Medium Shading 1" w:semiHidden="0" w:uiPriority="63" w:unhideWhenUsed="0"/>
-    <w:lsdException w:name="Medium Shading 2" w:semiHidden="0" w:uiPriority="64" w:unhideWhenUsed="0"/>
-    <w:lsdException w:name="Medium List 1" w:semiHidden="0" w:uiPriority="65" w:unhideWhenUsed="0"/>
-    <w:lsdException w:name="Medium List 2" w:semiHidden="0" w:uiPriority="66" w:unhideWhenUsed="0"/>
-    <w:lsdException w:name="Medium Grid 1" w:semiHidden="0" w:uiPriority="67" w:unhideWhenUsed="0"/>
-    <w:lsdException w:name="Medium Grid 2" w:semiHidden="0" w:uiPriority="68" w:unhideWhenUsed="0"/>
-    <w:lsdException w:name="Medium Grid 3" w:semiHidden="0" w:uiPriority="69" w:unhideWhenUsed="0"/>
-    <w:lsdException w:name="Dark List" w:semiHidden="0" w:uiPriority="70" w:unhideWhenUsed="0"/>
-    <w:lsdException w:name="Colorful Shading" w:semiHidden="0" w:uiPriority="71" w:unhideWhenUsed="0"/>
-    <w:lsdException w:name="Colorful List" w:semiHidden="0" w:uiPriority="72" w:unhideWhenUsed="0"/>
-    <w:lsdException w:name="Colorful Grid" w:semiHidden="0" w:uiPriority="73" w:unhideWhenUsed="0"/>
-    <w:lsdException w:name="Light Shading Accent 1" w:semiHidden="0" w:uiPriority="60" w:unhideWhenUsed="0"/>
-    <w:lsdException w:name="Light List Accent 1" w:semiHidden="0" w:uiPriority="61" w:unhideWhenUsed="0"/>
-    <w:lsdException w:name="Light Grid Accent 1" w:semiHidden="0" w:uiPriority="62" w:unhideWhenUsed="0"/>
-    <w:lsdException w:name="Medium Shading 1 Accent 1" w:semiHidden="0" w:uiPriority="63" w:unhideWhenUsed="0"/>
-    <w:lsdException w:name="Medium Shading 2 Accent 1" w:semiHidden="0" w:uiPriority="64" w:unhideWhenUsed="0"/>
-    <w:lsdException w:name="Medium List 1 Accent 1" w:semiHidden="0" w:uiPriority="65" w:unhideWhenUsed="0"/>
-    <w:lsdException w:name="Revision" w:unhideWhenUsed="0"/>
-    <w:lsdException w:name="List Paragraph" w:semiHidden="0" w:uiPriority="34" w:unhideWhenUsed="0" w:qFormat="1"/>
-    <w:lsdException w:name="Quote" w:semiHidden="0" w:uiPriority="29" w:unhideWhenUsed="0" w:qFormat="1"/>
-    <w:lsdException w:name="Intense Quote" w:semiHidden="0" w:uiPriority="30" w:unhideWhenUsed="0" w:qFormat="1"/>
-    <w:lsdException w:name="Medium List 2 Accent 1" w:semiHidden="0" w:uiPriority="66" w:unhideWhenUsed="0"/>
-    <w:lsdException w:name="Medium Grid 1 Accent 1" w:semiHidden="0" w:uiPriority="67" w:unhideWhenUsed="0"/>
-    <w:lsdException w:name="Medium Grid 2 Accent 1" w:semiHidden="0" w:uiPriority="68" w:unhideWhenUsed="0"/>
-    <w:lsdException w:name="Medium Grid 3 Accent 1" w:semiHidden="0" w:uiPriority="69" w:unhideWhenUsed="0"/>
-    <w:lsdException w:name="Dark List Accent 1" w:semiHidden="0" w:uiPriority="70" w:unhideWhenUsed="0"/>
-    <w:lsdException w:name="Colorful Shading Accent 1" w:semiHidden="0" w:uiPriority="71" w:unhideWhenUsed="0"/>
-    <w:lsdException w:name="Colorful List Accent 1" w:semiHidden="0" w:uiPriority="72" w:unhideWhenUsed="0"/>
-    <w:lsdException w:name="Colorful Grid Accent 1" w:semiHidden="0" w:uiPriority="73" w:unhideWhenUsed="0"/>
-    <w:lsdException w:name="Light Shading Accent 2" w:semiHidden="0" w:uiPriority="60" w:unhideWhenUsed="0"/>
-    <w:lsdException w:name="Light List Accent 2" w:semiHidden="0" w:uiPriority="61" w:unhideWhenUsed="0"/>
-    <w:lsdException w:name="Light Grid Accent 2" w:semiHidden="0" w:uiPriority="62" w:unhideWhenUsed="0"/>
-    <w:lsdException w:name="Medium Shading 1 Accent 2" w:semiHidden="0" w:uiPriority="63" w:unhideWhenUsed="0"/>
-    <w:lsdException w:name="Medium Shading 2 Accent 2" w:semiHidden="0" w:uiPriority="64" w:unhideWhenUsed="0"/>
-    <w:lsdException w:name="Medium List 1 Accent 2" w:semiHidden="0" w:uiPriority="65" w:unhideWhenUsed="0"/>
-    <w:lsdException w:name="Medium List 2 Accent 2" w:semiHidden="0" w:uiPriority="66" w:unhideWhenUsed="0"/>
-    <w:lsdException w:name="Medium Grid 1 Accent 2" w:semiHidden="0" w:uiPriority="67" w:unhideWhenUsed="0"/>
-    <w:lsdException w:name="Medium Grid 2 Accent 2" w:semiHidden="0" w:uiPriority="68" w:unhideWhenUsed="0"/>
-    <w:lsdException w:name="Medium Grid 3 Accent 2" w:semiHidden="0" w:uiPriority="69" w:unhideWhenUsed="0"/>
-    <w:lsdException w:name="Dark List Accent 2" w:semiHidden="0" w:uiPriority="70" w:unhideWhenUsed="0"/>
-    <w:lsdException w:name="Colorful Shading Accent 2" w:semiHidden="0" w:uiPriority="71" w:unhideWhenUsed="0"/>
-    <w:lsdException w:name="Colorful List Accent 2" w:semiHidden="0" w:uiPriority="72" w:unhideWhenUsed="0"/>
-    <w:lsdException w:name="Colorful Grid Accent 2" w:semiHidden="0" w:uiPriority="73" w:unhideWhenUsed="0"/>
-    <w:lsdException w:name="Light Shading Accent 3" w:semiHidden="0" w:uiPriority="60" w:unhideWhenUsed="0"/>
-    <w:lsdException w:name="Light List Accent 3" w:semiHidden="0" w:uiPriority="61" w:unhideWhenUsed="0"/>
-    <w:lsdException w:name="Light Grid Accent 3" w:semiHidden="0" w:uiPriority="62" w:unhideWhenUsed="0"/>
-    <w:lsdException w:name="Medium Shading 1 Accent 3" w:semiHidden="0" w:uiPriority="63" w:unhideWhenUsed="0"/>
-    <w:lsdException w:name="Medium Shading 2 Accent 3" w:semiHidden="0" w:uiPriority="64" w:unhideWhenUsed="0"/>
-    <w:lsdException w:name="Medium List 1 Accent 3" w:semiHidden="0" w:uiPriority="65" w:unhideWhenUsed="0"/>
-    <w:lsdException w:name="Medium List 2 Accent 3" w:semiHidden="0" w:uiPriority="66" w:unhideWhenUsed="0"/>
-    <w:lsdException w:name="Medium Grid 1 Accent 3" w:semiHidden="0" w:uiPriority="67" w:unhideWhenUsed="0"/>
-    <w:lsdException w:name="Medium Grid 2 Accent 3" w:semiHidden="0" w:uiPriority="68" w:unhideWhenUsed="0"/>
-    <w:lsdException w:name="Medium Grid 3 Accent 3" w:semiHidden="0" w:uiPriority="69" w:unhideWhenUsed="0"/>
-    <w:lsdException w:name="Dark List Accent 3" w:semiHidden="0" w:uiPriority="70" w:unhideWhenUsed="0"/>
-    <w:lsdException w:name="Colorful Shading Accent 3" w:semiHidden="0" w:uiPriority="71" w:unhideWhenUsed="0"/>
-    <w:lsdException w:name="Colorful List Accent 3" w:semiHidden="0" w:uiPriority="72" w:unhideWhenUsed="0"/>
-    <w:lsdException w:name="Colorful Grid Accent 3" w:semiHidden="0" w:uiPriority="73" w:unhideWhenUsed="0"/>
-    <w:lsdException w:name="Light Shading Accent 4" w:semiHidden="0" w:uiPriority="60" w:unhideWhenUsed="0"/>
-    <w:lsdException w:name="Light List Accent 4" w:semiHidden="0" w:uiPriority="61" w:unhideWhenUsed="0"/>
-    <w:lsdException w:name="Light Grid Accent 4" w:semiHidden="0" w:uiPriority="62" w:unhideWhenUsed="0"/>
-    <w:lsdException w:name="Medium Shading 1 Accent 4" w:semiHidden="0" w:uiPriority="63" w:unhideWhenUsed="0"/>
-    <w:lsdException w:name="Medium Shading 2 Accent 4" w:semiHidden="0" w:uiPriority="64" w:unhideWhenUsed="0"/>
-    <w:lsdException w:name="Medium List 1 Accent 4" w:semiHidden="0" w:uiPriority="65" w:unhideWhenUsed="0"/>
-    <w:lsdException w:name="Medium List 2 Accent 4" w:semiHidden="0" w:uiPriority="66" w:unhideWhenUsed="0"/>
-    <w:lsdException w:name="Medium Grid 1 Accent 4" w:semiHidden="0" w:uiPriority="67" w:unhideWhenUsed="0"/>
-    <w:lsdException w:name="Medium Grid 2 Accent 4" w:semiHidden="0" w:uiPriority="68" w:unhideWhenUsed="0"/>
-    <w:lsdException w:name="Medium Grid 3 Accent 4" w:semiHidden="0" w:uiPriority="69" w:unhideWhenUsed="0"/>
-    <w:lsdException w:name="Dark List Accent 4" w:semiHidden="0" w:uiPriority="70" w:unhideWhenUsed="0"/>
-    <w:lsdException w:name="Colorful Shading Accent 4" w:semiHidden="0" w:uiPriority="71" w:unhideWhenUsed="0"/>
-    <w:lsdException w:name="Colorful List Accent 4" w:semiHidden="0" w:uiPriority="72" w:unhideWhenUsed="0"/>
-    <w:lsdException w:name="Colorful Grid Accent 4" w:semiHidden="0" w:uiPriority="73" w:unhideWhenUsed="0"/>
-    <w:lsdException w:name="Light Shading Accent 5" w:semiHidden="0" w:uiPriority="60" w:unhideWhenUsed="0"/>
-    <w:lsdException w:name="Light List Accent 5" w:semiHidden="0" w:uiPriority="61" w:unhideWhenUsed="0"/>
-    <w:lsdException w:name="Light Grid Accent 5" w:semiHidden="0" w:uiPriority="62" w:unhideWhenUsed="0"/>
-    <w:lsdException w:name="Medium Shading 1 Accent 5" w:semiHidden="0" w:uiPriority="63" w:unhideWhenUsed="0"/>
-    <w:lsdException w:name="Medium Shading 2 Accent 5" w:semiHidden="0" w:uiPriority="64" w:unhideWhenUsed="0"/>
-    <w:lsdException w:name="Medium List 1 Accent 5" w:semiHidden="0" w:uiPriority="65" w:unhideWhenUsed="0"/>
-    <w:lsdException w:name="Medium List 2 Accent 5" w:semiHidden="0" w:uiPriority="66" w:unhideWhenUsed="0"/>
-    <w:lsdException w:name="Medium Grid 1 Accent 5" w:semiHidden="0" w:uiPriority="67" w:unhideWhenUsed="0"/>
-    <w:lsdException w:name="Medium Grid 2 Accent 5" w:semiHidden="0" w:uiPriority="68" w:unhideWhenUsed="0"/>
-    <w:lsdException w:name="Medium Grid 3 Accent 5" w:semiHidden="0" w:uiPriority="69" w:unhideWhenUsed="0"/>
-    <w:lsdException w:name="Dark List Accent 5" w:semiHidden="0" w:uiPriority="70" w:unhideWhenUsed="0"/>
-    <w:lsdException w:name="Colorful Shading Accent 5" w:semiHidden="0" w:uiPriority="71" w:unhideWhenUsed="0"/>
-    <w:lsdException w:name="Colorful List Accent 5" w:semiHidden="0" w:uiPriority="72" w:unhideWhenUsed="0"/>
-    <w:lsdException w:name="Colorful Grid Accent 5" w:semiHidden="0" w:uiPriority="73" w:unhideWhenUsed="0"/>
-    <w:lsdException w:name="Light Shading Accent 6" w:semiHidden="0" w:uiPriority="60" w:unhideWhenUsed="0"/>
-    <w:lsdException w:name="Light List Accent 6" w:semiHidden="0" w:uiPriority="61" w:unhideWhenUsed="0"/>
-    <w:lsdException w:name="Light Grid Accent 6" w:semiHidden="0" w:uiPriority="62" w:unhideWhenUsed="0"/>
-    <w:lsdException w:name="Medium Shading 1 Accent 6" w:semiHidden="0" w:uiPriority="63" w:unhideWhenUsed="0"/>
-    <w:lsdException w:name="Medium Shading 2 Accent 6" w:semiHidden="0" w:uiPriority="64" w:unhideWhenUsed="0"/>
-    <w:lsdException w:name="Medium List 1 Accent 6" w:semiHidden="0" w:uiPriority="65" w:unhideWhenUsed="0"/>
-    <w:lsdException w:name="Medium List 2 Accent 6" w:semiHidden="0" w:uiPriority="66" w:unhideWhenUsed="0"/>
-    <w:lsdException w:name="Medium Grid 1 Accent 6" w:semiHidden="0" w:uiPriority="67" w:unhideWhenUsed="0"/>
-    <w:lsdException w:name="Medium Grid 2 Accent 6" w:semiHidden="0" w:uiPriority="68" w:unhideWhenUsed="0"/>
-    <w:lsdException w:name="Medium Grid 3 Accent 6" w:semiHidden="0" w:uiPriority="69" w:unhideWhenUsed="0"/>
-    <w:lsdException w:name="Dark List Accent 6" w:semiHidden="0" w:uiPriority="70" w:unhideWhenUsed="0"/>
-    <w:lsdException w:name="Colorful Shading Accent 6" w:semiHidden="0" w:uiPriority="71" w:unhideWhenUsed="0"/>
-    <w:lsdException w:name="Colorful List Accent 6" w:semiHidden="0" w:uiPriority="72" w:unhideWhenUsed="0"/>
-    <w:lsdException w:name="Colorful Grid Accent 6" w:semiHidden="0" w:uiPriority="73" w:unhideWhenUsed="0"/>
-    <w:lsdException w:name="Subtle Emphasis" w:semiHidden="0" w:uiPriority="19" w:unhideWhenUsed="0" w:qFormat="1"/>
-    <w:lsdException w:name="Intense Emphasis" w:semiHidden="0" w:uiPriority="21" w:unhideWhenUsed="0" w:qFormat="1"/>
-    <w:lsdException w:name="Subtle Reference" w:semiHidden="0" w:uiPriority="31" w:unhideWhenUsed="0" w:qFormat="1"/>
-    <w:lsdException w:name="Intense Reference" w:semiHidden="0" w:uiPriority="32" w:unhideWhenUsed="0" w:qFormat="1"/>
-    <w:lsdException w:name="Book Title" w:semiHidden="0" w:uiPriority="33" w:unhideWhenUsed="0" w:qFormat="1"/>
-    <w:lsdException w:name="Bibliography" w:uiPriority="37"/>
-    <w:lsdException w:name="TOC Heading" w:uiPriority="39" w:qFormat="1"/>
+  <w:latentStyles w:defLockedState="0" w:defUIPriority="99" w:defSemiHidden="0" w:defUnhideWhenUsed="0" w:defQFormat="0" w:count="371">
+    <w:lsdException w:name="Normal" w:uiPriority="0" w:qFormat="1"/>
+    <w:lsdException w:name="heading 1" w:uiPriority="9" w:qFormat="1"/>
+    <w:lsdException w:name="heading 2" w:semiHidden="1" w:uiPriority="9" w:unhideWhenUsed="1" w:qFormat="1"/>
+    <w:lsdException w:name="heading 3" w:semiHidden="1" w:uiPriority="9" w:unhideWhenUsed="1" w:qFormat="1"/>
+    <w:lsdException w:name="heading 4" w:semiHidden="1" w:uiPriority="9" w:unhideWhenUsed="1" w:qFormat="1"/>
+    <w:lsdException w:name="heading 5" w:semiHidden="1" w:uiPriority="9" w:unhideWhenUsed="1" w:qFormat="1"/>
+    <w:lsdException w:name="heading 6" w:semiHidden="1" w:uiPriority="9" w:unhideWhenUsed="1" w:qFormat="1"/>
+    <w:lsdException w:name="heading 7" w:semiHidden="1" w:uiPriority="9" w:unhideWhenUsed="1" w:qFormat="1"/>
+    <w:lsdException w:name="heading 8" w:semiHidden="1" w:uiPriority="9" w:unhideWhenUsed="1" w:qFormat="1"/>
+    <w:lsdException w:name="heading 9" w:semiHidden="1" w:uiPriority="9" w:unhideWhenUsed="1" w:qFormat="1"/>
+    <w:lsdException w:name="index 1" w:semiHidden="1" w:unhideWhenUsed="1"/>
+    <w:lsdException w:name="index 2" w:semiHidden="1" w:unhideWhenUsed="1"/>
+    <w:lsdException w:name="index 3" w:semiHidden="1" w:unhideWhenUsed="1"/>
+    <w:lsdException w:name="index 4" w:semiHidden="1" w:unhideWhenUsed="1"/>
+    <w:lsdException w:name="index 5" w:semiHidden="1" w:unhideWhenUsed="1"/>
+    <w:lsdException w:name="index 6" w:semiHidden="1" w:unhideWhenUsed="1"/>
+    <w:lsdException w:name="index 7" w:semiHidden="1" w:unhideWhenUsed="1"/>
+    <w:lsdException w:name="index 8" w:semiHidden="1" w:unhideWhenUsed="1"/>
+    <w:lsdException w:name="index 9" w:semiHidden="1" w:unhideWhenUsed="1"/>
+    <w:lsdException w:name="toc 1" w:semiHidden="1" w:uiPriority="39" w:unhideWhenUsed="1"/>
+    <w:lsdException w:name="toc 2" w:semiHidden="1" w:uiPriority="39" w:unhideWhenUsed="1"/>
+    <w:lsdException w:name="toc 3" w:semiHidden="1" w:uiPriority="39" w:unhideWhenUsed="1"/>
+    <w:lsdException w:name="toc 4" w:semiHidden="1" w:uiPriority="39" w:unhideWhenUsed="1"/>
+    <w:lsdException w:name="toc 5" w:semiHidden="1" w:uiPriority="39" w:unhideWhenUsed="1"/>
+    <w:lsdException w:name="toc 6" w:semiHidden="1" w:uiPriority="39" w:unhideWhenUsed="1"/>
+    <w:lsdException w:name="toc 7" w:semiHidden="1" w:uiPriority="39" w:unhideWhenUsed="1"/>
+    <w:lsdException w:name="toc 8" w:semiHidden="1" w:uiPriority="39" w:unhideWhenUsed="1"/>
+    <w:lsdException w:name="toc 9" w:semiHidden="1" w:uiPriority="39" w:unhideWhenUsed="1"/>
+    <w:lsdException w:name="Normal Indent" w:semiHidden="1" w:unhideWhenUsed="1"/>
+    <w:lsdException w:name="footnote text" w:semiHidden="1" w:unhideWhenUsed="1"/>
+    <w:lsdException w:name="annotation text" w:semiHidden="1" w:unhideWhenUsed="1"/>
+    <w:lsdException w:name="header" w:semiHidden="1" w:unhideWhenUsed="1"/>
+    <w:lsdException w:name="footer" w:semiHidden="1" w:unhideWhenUsed="1"/>
+    <w:lsdException w:name="index heading" w:semiHidden="1" w:unhideWhenUsed="1"/>
+    <w:lsdException w:name="caption" w:semiHidden="1" w:uiPriority="35" w:unhideWhenUsed="1" w:qFormat="1"/>
+    <w:lsdException w:name="table of figures" w:semiHidden="1" w:unhideWhenUsed="1"/>
+    <w:lsdException w:name="envelope address" w:semiHidden="1" w:unhideWhenUsed="1"/>
+    <w:lsdException w:name="envelope return" w:semiHidden="1" w:unhideWhenUsed="1"/>
+    <w:lsdException w:name="footnote reference" w:semiHidden="1" w:unhideWhenUsed="1"/>
+    <w:lsdException w:name="annotation reference" w:semiHidden="1" w:unhideWhenUsed="1"/>
+    <w:lsdException w:name="line number" w:semiHidden="1" w:unhideWhenUsed="1"/>
+    <w:lsdException w:name="page number" w:semiHidden="1" w:unhideWhenUsed="1"/>
+    <w:lsdException w:name="endnote reference" w:semiHidden="1" w:unhideWhenUsed="1"/>
+    <w:lsdException w:name="endnote text" w:semiHidden="1" w:unhideWhenUsed="1"/>
+    <w:lsdException w:name="table of authorities" w:semiHidden="1" w:unhideWhenUsed="1"/>
+    <w:lsdException w:name="macro" w:semiHidden="1" w:unhideWhenUsed="1"/>
+    <w:lsdException w:name="toa heading" w:semiHidden="1" w:unhideWhenUsed="1"/>
+    <w:lsdException w:name="List" w:semiHidden="1" w:unhideWhenUsed="1"/>
+    <w:lsdException w:name="List Bullet" w:semiHidden="1" w:unhideWhenUsed="1"/>
+    <w:lsdException w:name="List Number" w:semiHidden="1" w:unhideWhenUsed="1"/>
+    <w:lsdException w:name="List 2" w:semiHidden="1" w:unhideWhenUsed="1"/>
+    <w:lsdException w:name="List 3" w:semiHidden="1" w:unhideWhenUsed="1"/>
+    <w:lsdException w:name="List 4" w:semiHidden="1" w:unhideWhenUsed="1"/>
+    <w:lsdException w:name="List 5" w:semiHidden="1" w:unhideWhenUsed="1"/>
+    <w:lsdException w:name="List Bullet 2" w:semiHidden="1" w:unhideWhenUsed="1"/>
+    <w:lsdException w:name="List Bullet 3" w:semiHidden="1" w:unhideWhenUsed="1"/>
+    <w:lsdException w:name="List Bullet 4" w:semiHidden="1" w:unhideWhenUsed="1"/>
+    <w:lsdException w:name="List Bullet 5" w:semiHidden="1" w:unhideWhenUsed="1"/>
+    <w:lsdException w:name="List Number 2" w:semiHidden="1" w:unhideWhenUsed="1"/>
+    <w:lsdException w:name="List Number 3" w:semiHidden="1" w:unhideWhenUsed="1"/>
+    <w:lsdException w:name="List Number 4" w:semiHidden="1" w:unhideWhenUsed="1"/>
+    <w:lsdException w:name="List Number 5" w:semiHidden="1" w:unhideWhenUsed="1"/>
+    <w:lsdException w:name="Title" w:uiPriority="10" w:qFormat="1"/>
+    <w:lsdException w:name="Closing" w:semiHidden="1" w:unhideWhenUsed="1"/>
+    <w:lsdException w:name="Signature" w:semiHidden="1" w:unhideWhenUsed="1"/>
+    <w:lsdException w:name="Default Paragraph Font" w:semiHidden="1" w:uiPriority="1" w:unhideWhenUsed="1"/>
+    <w:lsdException w:name="Body Text" w:semiHidden="1" w:unhideWhenUsed="1"/>
+    <w:lsdException w:name="Body Text Indent" w:semiHidden="1" w:unhideWhenUsed="1"/>
+    <w:lsdException w:name="List Continue" w:semiHidden="1" w:unhideWhenUsed="1"/>
+    <w:lsdException w:name="List Continue 2" w:semiHidden="1" w:unhideWhenUsed="1"/>
+    <w:lsdException w:name="List Continue 3" w:semiHidden="1" w:unhideWhenUsed="1"/>
+    <w:lsdException w:name="List Continue 4" w:semiHidden="1" w:unhideWhenUsed="1"/>
+    <w:lsdException w:name="List Continue 5" w:semiHidden="1" w:unhideWhenUsed="1"/>
+    <w:lsdException w:name="Message Header" w:semiHidden="1" w:unhideWhenUsed="1"/>
+    <w:lsdException w:name="Subtitle" w:uiPriority="11" w:qFormat="1"/>
+    <w:lsdException w:name="Salutation" w:semiHidden="1" w:unhideWhenUsed="1"/>
+    <w:lsdException w:name="Date" w:semiHidden="1" w:unhideWhenUsed="1"/>
+    <w:lsdException w:name="Body Text First Indent" w:semiHidden="1" w:unhideWhenUsed="1"/>
+    <w:lsdException w:name="Body Text First Indent 2" w:semiHidden="1" w:unhideWhenUsed="1"/>
+    <w:lsdException w:name="Note Heading" w:semiHidden="1" w:unhideWhenUsed="1"/>
+    <w:lsdException w:name="Body Text 2" w:semiHidden="1" w:unhideWhenUsed="1"/>
+    <w:lsdException w:name="Body Text 3" w:semiHidden="1" w:unhideWhenUsed="1"/>
+    <w:lsdException w:name="Body Text Indent 2" w:semiHidden="1" w:unhideWhenUsed="1"/>
+    <w:lsdException w:name="Body Text Indent 3" w:semiHidden="1" w:unhideWhenUsed="1"/>
+    <w:lsdException w:name="Block Text" w:semiHidden="1" w:unhideWhenUsed="1"/>
+    <w:lsdException w:name="Hyperlink" w:semiHidden="1" w:unhideWhenUsed="1"/>
+    <w:lsdException w:name="FollowedHyperlink" w:semiHidden="1" w:unhideWhenUsed="1"/>
+    <w:lsdException w:name="Strong" w:uiPriority="22" w:qFormat="1"/>
+    <w:lsdException w:name="Emphasis" w:uiPriority="20" w:qFormat="1"/>
+    <w:lsdException w:name="Document Map" w:semiHidden="1" w:unhideWhenUsed="1"/>
+    <w:lsdException w:name="Plain Text" w:semiHidden="1" w:unhideWhenUsed="1"/>
+    <w:lsdException w:name="E-mail Signature" w:semiHidden="1" w:unhideWhenUsed="1"/>
+    <w:lsdException w:name="HTML Top of Form" w:semiHidden="1" w:unhideWhenUsed="1"/>
+    <w:lsdException w:name="HTML Bottom of Form" w:semiHidden="1" w:unhideWhenUsed="1"/>
+    <w:lsdException w:name="Normal (Web)" w:semiHidden="1" w:unhideWhenUsed="1"/>
+    <w:lsdException w:name="HTML Acronym" w:semiHidden="1" w:unhideWhenUsed="1"/>
+    <w:lsdException w:name="HTML Address" w:semiHidden="1" w:unhideWhenUsed="1"/>
+    <w:lsdException w:name="HTML Cite" w:semiHidden="1" w:unhideWhenUsed="1"/>
+    <w:lsdException w:name="HTML Code" w:semiHidden="1" w:unhideWhenUsed="1"/>
+    <w:lsdException w:name="HTML Definition" w:semiHidden="1" w:unhideWhenUsed="1"/>
+    <w:lsdException w:name="HTML Keyboard" w:semiHidden="1" w:unhideWhenUsed="1"/>
+    <w:lsdException w:name="HTML Preformatted" w:semiHidden="1" w:unhideWhenUsed="1"/>
+    <w:lsdException w:name="HTML Sample" w:semiHidden="1" w:unhideWhenUsed="1"/>
+    <w:lsdException w:name="HTML Typewriter" w:semiHidden="1" w:unhideWhenUsed="1"/>
+    <w:lsdException w:name="HTML Variable" w:semiHidden="1" w:unhideWhenUsed="1"/>
+    <w:lsdException w:name="Normal Table" w:semiHidden="1" w:unhideWhenUsed="1"/>
+    <w:lsdException w:name="annotation subject" w:semiHidden="1" w:unhideWhenUsed="1"/>
+    <w:lsdException w:name="No List" w:semiHidden="1" w:unhideWhenUsed="1"/>
+    <w:lsdException w:name="Outline List 1" w:semiHidden="1" w:unhideWhenUsed="1"/>
+    <w:lsdException w:name="Outline List 2" w:semiHidden="1" w:unhideWhenUsed="1"/>
+    <w:lsdException w:name="Outline List 3" w:semiHidden="1" w:unhideWhenUsed="1"/>
+    <w:lsdException w:name="Table Simple 1" w:semiHidden="1" w:unhideWhenUsed="1"/>
+    <w:lsdException w:name="Table Simple 2" w:semiHidden="1" w:unhideWhenUsed="1"/>
+    <w:lsdException w:name="Table Simple 3" w:semiHidden="1" w:unhideWhenUsed="1"/>
+    <w:lsdException w:name="Table Classic 1" w:semiHidden="1" w:unhideWhenUsed="1"/>
+    <w:lsdException w:name="Table Classic 2" w:semiHidden="1" w:unhideWhenUsed="1"/>
+    <w:lsdException w:name="Table Classic 3" w:semiHidden="1" w:unhideWhenUsed="1"/>
+    <w:lsdException w:name="Table Classic 4" w:semiHidden="1" w:unhideWhenUsed="1"/>
+    <w:lsdException w:name="Table Colorful 1" w:semiHidden="1" w:unhideWhenUsed="1"/>
+    <w:lsdException w:name="Table Colorful 2" w:semiHidden="1" w:unhideWhenUsed="1"/>
+    <w:lsdException w:name="Table Colorful 3" w:semiHidden="1" w:unhideWhenUsed="1"/>
+    <w:lsdException w:name="Table Columns 1" w:semiHidden="1" w:unhideWhenUsed="1"/>
+    <w:lsdException w:name="Table Columns 2" w:semiHidden="1" w:unhideWhenUsed="1"/>
+    <w:lsdException w:name="Table Columns 3" w:semiHidden="1" w:unhideWhenUsed="1"/>
+    <w:lsdException w:name="Table Columns 4" w:semiHidden="1" w:unhideWhenUsed="1"/>
+    <w:lsdException w:name="Table Columns 5" w:semiHidden="1" w:unhideWhenUsed="1"/>
+    <w:lsdException w:name="Table Grid 1" w:semiHidden="1" w:unhideWhenUsed="1"/>
+    <w:lsdException w:name="Table Grid 2" w:semiHidden="1" w:unhideWhenUsed="1"/>
+    <w:lsdException w:name="Table Grid 3" w:semiHidden="1" w:unhideWhenUsed="1"/>
+    <w:lsdException w:name="Table Grid 4" w:semiHidden="1" w:unhideWhenUsed="1"/>
+    <w:lsdException w:name="Table Grid 5" w:semiHidden="1" w:unhideWhenUsed="1"/>
+    <w:lsdException w:name="Table Grid 6" w:semiHidden="1" w:unhideWhenUsed="1"/>
+    <w:lsdException w:name="Table Grid 7" w:semiHidden="1" w:unhideWhenUsed="1"/>
+    <w:lsdException w:name="Table Grid 8" w:semiHidden="1" w:unhideWhenUsed="1"/>
+    <w:lsdException w:name="Table List 1" w:semiHidden="1" w:unhideWhenUsed="1"/>
+    <w:lsdException w:name="Table List 2" w:semiHidden="1" w:unhideWhenUsed="1"/>
+    <w:lsdException w:name="Table List 3" w:semiHidden="1" w:unhideWhenUsed="1"/>
+    <w:lsdException w:name="Table List 4" w:semiHidden="1" w:unhideWhenUsed="1"/>
+    <w:lsdException w:name="Table List 5" w:semiHidden="1" w:unhideWhenUsed="1"/>
+    <w:lsdException w:name="Table List 6" w:semiHidden="1" w:unhideWhenUsed="1"/>
+    <w:lsdException w:name="Table List 7" w:semiHidden="1" w:unhideWhenUsed="1"/>
+    <w:lsdException w:name="Table List 8" w:semiHidden="1" w:unhideWhenUsed="1"/>
+    <w:lsdException w:name="Table 3D effects 1" w:semiHidden="1" w:unhideWhenUsed="1"/>
+    <w:lsdException w:name="Table 3D effects 2" w:semiHidden="1" w:unhideWhenUsed="1"/>
+    <w:lsdException w:name="Table 3D effects 3" w:semiHidden="1" w:unhideWhenUsed="1"/>
+    <w:lsdException w:name="Table Contemporary" w:semiHidden="1" w:unhideWhenUsed="1"/>
+    <w:lsdException w:name="Table Elegant" w:semiHidden="1" w:unhideWhenUsed="1"/>
+    <w:lsdException w:name="Table Professional" w:semiHidden="1" w:unhideWhenUsed="1"/>
+    <w:lsdException w:name="Table Subtle 1" w:semiHidden="1" w:unhideWhenUsed="1"/>
+    <w:lsdException w:name="Table Subtle 2" w:semiHidden="1" w:unhideWhenUsed="1"/>
+    <w:lsdException w:name="Table Web 1" w:semiHidden="1" w:unhideWhenUsed="1"/>
+    <w:lsdException w:name="Table Web 2" w:semiHidden="1" w:unhideWhenUsed="1"/>
+    <w:lsdException w:name="Table Web 3" w:semiHidden="1" w:unhideWhenUsed="1"/>
+    <w:lsdException w:name="Balloon Text" w:semiHidden="1" w:unhideWhenUsed="1"/>
+    <w:lsdException w:name="Table Grid" w:uiPriority="59"/>
+    <w:lsdException w:name="Table Theme" w:semiHidden="1" w:unhideWhenUsed="1"/>
+    <w:lsdException w:name="Placeholder Text" w:semiHidden="1"/>
+    <w:lsdException w:name="No Spacing" w:uiPriority="1" w:qFormat="1"/>
+    <w:lsdException w:name="Light Shading" w:uiPriority="60"/>
+    <w:lsdException w:name="Light List" w:uiPriority="61"/>
+    <w:lsdException w:name="Light Grid" w:uiPriority="62"/>
+    <w:lsdException w:name="Medium Shading 1" w:uiPriority="63"/>
+    <w:lsdException w:name="Medium Shading 2" w:uiPriority="64"/>
+    <w:lsdException w:name="Medium List 1" w:uiPriority="65"/>
+    <w:lsdException w:name="Medium List 2" w:uiPriority="66"/>
+    <w:lsdException w:name="Medium Grid 1" w:uiPriority="67"/>
+    <w:lsdException w:name="Medium Grid 2" w:uiPriority="68"/>
+    <w:lsdException w:name="Medium Grid 3" w:uiPriority="69"/>
+    <w:lsdException w:name="Dark List" w:uiPriority="70"/>
+    <w:lsdException w:name="Colorful Shading" w:uiPriority="71"/>
+    <w:lsdException w:name="Colorful List" w:uiPriority="72"/>
+    <w:lsdException w:name="Colorful Grid" w:uiPriority="73"/>
+    <w:lsdException w:name="Light Shading Accent 1" w:uiPriority="60"/>
+    <w:lsdException w:name="Light List Accent 1" w:uiPriority="61"/>
+    <w:lsdException w:name="Light Grid Accent 1" w:uiPriority="62"/>
+    <w:lsdException w:name="Medium Shading 1 Accent 1" w:uiPriority="63"/>
+    <w:lsdException w:name="Medium Shading 2 Accent 1" w:uiPriority="64"/>
+    <w:lsdException w:name="Medium List 1 Accent 1" w:uiPriority="65"/>
+    <w:lsdException w:name="Revision" w:semiHidden="1"/>
+    <w:lsdException w:name="List Paragraph" w:uiPriority="34" w:qFormat="1"/>
+    <w:lsdException w:name="Quote" w:uiPriority="29" w:qFormat="1"/>
+    <w:lsdException w:name="Intense Quote" w:uiPriority="30" w:qFormat="1"/>
+    <w:lsdException w:name="Medium List 2 Accent 1" w:uiPriority="66"/>
+    <w:lsdException w:name="Medium Grid 1 Accent 1" w:uiPriority="67"/>
+    <w:lsdException w:name="Medium Grid 2 Accent 1" w:uiPriority="68"/>
+    <w:lsdException w:name="Medium Grid 3 Accent 1" w:uiPriority="69"/>
+    <w:lsdException w:name="Dark List Accent 1" w:uiPriority="70"/>
+    <w:lsdException w:name="Colorful Shading Accent 1" w:uiPriority="71"/>
+    <w:lsdException w:name="Colorful List Accent 1" w:uiPriority="72"/>
+    <w:lsdException w:name="Colorful Grid Accent 1" w:uiPriority="73"/>
+    <w:lsdException w:name="Light Shading Accent 2" w:uiPriority="60"/>
+    <w:lsdException w:name="Light List Accent 2" w:uiPriority="61"/>
+    <w:lsdException w:name="Light Grid Accent 2" w:uiPriority="62"/>
+    <w:lsdException w:name="Medium Shading 1 Accent 2" w:uiPriority="63"/>
+    <w:lsdException w:name="Medium Shading 2 Accent 2" w:uiPriority="64"/>
+    <w:lsdException w:name="Medium List 1 Accent 2" w:uiPriority="65"/>
+    <w:lsdException w:name="Medium List 2 Accent 2" w:uiPriority="66"/>
+    <w:lsdException w:name="Medium Grid 1 Accent 2" w:uiPriority="67"/>
+    <w:lsdException w:name="Medium Grid 2 Accent 2" w:uiPriority="68"/>
+    <w:lsdException w:name="Medium Grid 3 Accent 2" w:uiPriority="69"/>
+    <w:lsdException w:name="Dark List Accent 2" w:uiPriority="70"/>
+    <w:lsdException w:name="Colorful Shading Accent 2" w:uiPriority="71"/>
+    <w:lsdException w:name="Colorful List Accent 2" w:uiPriority="72"/>
+    <w:lsdException w:name="Colorful Grid Accent 2" w:uiPriority="73"/>
+    <w:lsdException w:name="Light Shading Accent 3" w:uiPriority="60"/>
+    <w:lsdException w:name="Light List Accent 3" w:uiPriority="61"/>
+    <w:lsdException w:name="Light Grid Accent 3" w:uiPriority="62"/>
+    <w:lsdException w:name="Medium Shading 1 Accent 3" w:uiPriority="63"/>
+    <w:lsdException w:name="Medium Shading 2 Accent 3" w:uiPriority="64"/>
+    <w:lsdException w:name="Medium List 1 Accent 3" w:uiPriority="65"/>
+    <w:lsdException w:name="Medium List 2 Accent 3" w:uiPriority="66"/>
+    <w:lsdException w:name="Medium Grid 1 Accent 3" w:uiPriority="67"/>
+    <w:lsdException w:name="Medium Grid 2 Accent 3" w:uiPriority="68"/>
+    <w:lsdException w:name="Medium Grid 3 Accent 3" w:uiPriority="69"/>
+    <w:lsdException w:name="Dark List Accent 3" w:uiPriority="70"/>
+    <w:lsdException w:name="Colorful Shading Accent 3" w:uiPriority="71"/>
+    <w:lsdException w:name="Colorful List Accent 3" w:uiPriority="72"/>
+    <w:lsdException w:name="Colorful Grid Accent 3" w:uiPriority="73"/>
+    <w:lsdException w:name="Light Shading Accent 4" w:uiPriority="60"/>
+    <w:lsdException w:name="Light List Accent 4" w:uiPriority="61"/>
+    <w:lsdException w:name="Light Grid Accent 4" w:uiPriority="62"/>
+    <w:lsdException w:name="Medium Shading 1 Accent 4" w:uiPriority="63"/>
+    <w:lsdException w:name="Medium Shading 2 Accent 4" w:uiPriority="64"/>
+    <w:lsdException w:name="Medium List 1 Accent 4" w:uiPriority="65"/>
+    <w:lsdException w:name="Medium List 2 Accent 4" w:uiPriority="66"/>
+    <w:lsdException w:name="Medium Grid 1 Accent 4" w:uiPriority="67"/>
+    <w:lsdException w:name="Medium Grid 2 Accent 4" w:uiPriority="68"/>
+    <w:lsdException w:name="Medium Grid 3 Accent 4" w:uiPriority="69"/>
+    <w:lsdException w:name="Dark List Accent 4" w:uiPriority="70"/>
+    <w:lsdException w:name="Colorful Shading Accent 4" w:uiPriority="71"/>
+    <w:lsdException w:name="Colorful List Accent 4" w:uiPriority="72"/>
+    <w:lsdException w:name="Colorful Grid Accent 4" w:uiPriority="73"/>
+    <w:lsdException w:name="Light Shading Accent 5" w:uiPriority="60"/>
+    <w:lsdException w:name="Light List Accent 5" w:uiPriority="61"/>
+    <w:lsdException w:name="Light Grid Accent 5" w:uiPriority="62"/>
+    <w:lsdException w:name="Medium Shading 1 Accent 5" w:uiPriority="63"/>
+    <w:lsdException w:name="Medium Shading 2 Accent 5" w:uiPriority="64"/>
+    <w:lsdException w:name="Medium List 1 Accent 5" w:uiPriority="65"/>
+    <w:lsdException w:name="Medium List 2 Accent 5" w:uiPriority="66"/>
+    <w:lsdException w:name="Medium Grid 1 Accent 5" w:uiPriority="67"/>
+    <w:lsdException w:name="Medium Grid 2 Accent 5" w:uiPriority="68"/>
+    <w:lsdException w:name="Medium Grid 3 Accent 5" w:uiPriority="69"/>
+    <w:lsdException w:name="Dark List Accent 5" w:uiPriority="70"/>
+    <w:lsdException w:name="Colorful Shading Accent 5" w:uiPriority="71"/>
+    <w:lsdException w:name="Colorful List Accent 5" w:uiPriority="72"/>
+    <w:lsdException w:name="Colorful Grid Accent 5" w:uiPriority="73"/>
+    <w:lsdException w:name="Light Shading Accent 6" w:uiPriority="60"/>
+    <w:lsdException w:name="Light List Accent 6" w:uiPriority="61"/>
+    <w:lsdException w:name="Light Grid Accent 6" w:uiPriority="62"/>
+    <w:lsdException w:name="Medium Shading 1 Accent 6" w:uiPriority="63"/>
+    <w:lsdException w:name="Medium Shading 2 Accent 6" w:uiPriority="64"/>
+    <w:lsdException w:name="Medium List 1 Accent 6" w:uiPriority="65"/>
+    <w:lsdException w:name="Medium List 2 Accent 6" w:uiPriority="66"/>
+    <w:lsdException w:name="Medium Grid 1 Accent 6" w:uiPriority="67"/>
+    <w:lsdException w:name="Medium Grid 2 Accent 6" w:uiPriority="68"/>
+    <w:lsdException w:name="Medium Grid 3 Accent 6" w:uiPriority="69"/>
+    <w:lsdException w:name="Dark List Accent 6" w:uiPriority="70"/>
+    <w:lsdException w:name="Colorful Shading Accent 6" w:uiPriority="71"/>
+    <w:lsdException w:name="Colorful List Accent 6" w:uiPriority="72"/>
+    <w:lsdException w:name="Colorful Grid Accent 6" w:uiPriority="73"/>
+    <w:lsdException w:name="Subtle Emphasis" w:uiPriority="19" w:qFormat="1"/>
+    <w:lsdException w:name="Intense Emphasis" w:uiPriority="21" w:qFormat="1"/>
+    <w:lsdException w:name="Subtle Reference" w:uiPriority="31" w:qFormat="1"/>
+    <w:lsdException w:name="Intense Reference" w:uiPriority="32" w:qFormat="1"/>
+    <w:lsdException w:name="Book Title" w:uiPriority="33" w:qFormat="1"/>
+    <w:lsdException w:name="Bibliography" w:semiHidden="1" w:uiPriority="37" w:unhideWhenUsed="1"/>
+    <w:lsdException w:name="TOC Heading" w:semiHidden="1" w:uiPriority="39" w:unhideWhenUsed="1" w:qFormat="1"/>
+    <w:lsdException w:name="Plain Table 1" w:uiPriority="41"/>
+    <w:lsdException w:name="Plain Table 2" w:uiPriority="42"/>
+    <w:lsdException w:name="Plain Table 3" w:uiPriority="43"/>
+    <w:lsdException w:name="Plain Table 4" w:uiPriority="44"/>
+    <w:lsdException w:name="Plain Table 5" w:uiPriority="45"/>
+    <w:lsdException w:name="Grid Table Light" w:uiPriority="40"/>
+    <w:lsdException w:name="Grid Table 1 Light" w:uiPriority="46"/>
+    <w:lsdException w:name="Grid Table 2" w:uiPriority="47"/>
+    <w:lsdException w:name="Grid Table 3" w:uiPriority="48"/>
+    <w:lsdException w:name="Grid Table 4" w:uiPriority="49"/>
+    <w:lsdException w:name="Grid Table 5 Dark" w:uiPriority="50"/>
+    <w:lsdException w:name="Grid Table 6 Colorful" w:uiPriority="51"/>
+    <w:lsdException w:name="Grid Table 7 Colorful" w:uiPriority="52"/>
+    <w:lsdException w:name="Grid Table 1 Light Accent 1" w:uiPriority="46"/>
+    <w:lsdException w:name="Grid Table 2 Accent 1" w:uiPriority="47"/>
+    <w:lsdException w:name="Grid Table 3 Accent 1" w:uiPriority="48"/>
+    <w:lsdException w:name="Grid Table 4 Accent 1" w:uiPriority="49"/>
+    <w:lsdException w:name="Grid Table 5 Dark Accent 1" w:uiPriority="50"/>
+    <w:lsdException w:name="Grid Table 6 Colorful Accent 1" w:uiPriority="51"/>
+    <w:lsdException w:name="Grid Table 7 Colorful Accent 1" w:uiPriority="52"/>
+    <w:lsdException w:name="Grid Table 1 Light Accent 2" w:uiPriority="46"/>
+    <w:lsdException w:name="Grid Table 2 Accent 2" w:uiPriority="47"/>
+    <w:lsdException w:name="Grid Table 3 Accent 2" w:uiPriority="48"/>
+    <w:lsdException w:name="Grid Table 4 Accent 2" w:uiPriority="49"/>
+    <w:lsdException w:name="Grid Table 5 Dark Accent 2" w:uiPriority="50"/>
+    <w:lsdException w:name="Grid Table 6 Colorful Accent 2" w:uiPriority="51"/>
+    <w:lsdException w:name="Grid Table 7 Colorful Accent 2" w:uiPriority="52"/>
+    <w:lsdException w:name="Grid Table 1 Light Accent 3" w:uiPriority="46"/>
+    <w:lsdException w:name="Grid Table 2 Accent 3" w:uiPriority="47"/>
+    <w:lsdException w:name="Grid Table 3 Accent 3" w:uiPriority="48"/>
+    <w:lsdException w:name="Grid Table 4 Accent 3" w:uiPriority="49"/>
+    <w:lsdException w:name="Grid Table 5 Dark Accent 3" w:uiPriority="50"/>
+    <w:lsdException w:name="Grid Table 6 Colorful Accent 3" w:uiPriority="51"/>
+    <w:lsdException w:name="Grid Table 7 Colorful Accent 3" w:uiPriority="52"/>
+    <w:lsdException w:name="Grid Table 1 Light Accent 4" w:uiPriority="46"/>
+    <w:lsdException w:name="Grid Table 2 Accent 4" w:uiPriority="47"/>
+    <w:lsdException w:name="Grid Table 3 Accent 4" w:uiPriority="48"/>
+    <w:lsdException w:name="Grid Table 4 Accent 4" w:uiPriority="49"/>
+    <w:lsdException w:name="Grid Table 5 Dark Accent 4" w:uiPriority="50"/>
+    <w:lsdException w:name="Grid Table 6 Colorful Accent 4" w:uiPriority="51"/>
+    <w:lsdException w:name="Grid Table 7 Colorful Accent 4" w:uiPriority="52"/>
+    <w:lsdException w:name="Grid Table 1 Light Accent 5" w:uiPriority="46"/>
+    <w:lsdException w:name="Grid Table 2 Accent 5" w:uiPriority="47"/>
+    <w:lsdException w:name="Grid Table 3 Accent 5" w:uiPriority="48"/>
+    <w:lsdException w:name="Grid Table 4 Accent 5" w:uiPriority="49"/>
+    <w:lsdException w:name="Grid Table 5 Dark Accent 5" w:uiPriority="50"/>
+    <w:lsdException w:name="Grid Table 6 Colorful Accent 5" w:uiPriority="51"/>
+    <w:lsdException w:name="Grid Table 7 Colorful Accent 5" w:uiPriority="52"/>
+    <w:lsdException w:name="Grid Table 1 Light Accent 6" w:uiPriority="46"/>
+    <w:lsdException w:name="Grid Table 2 Accent 6" w:uiPriority="47"/>
+    <w:lsdException w:name="Grid Table 3 Accent 6" w:uiPriority="48"/>
+    <w:lsdException w:name="Grid Table 4 Accent 6" w:uiPriority="49"/>
+    <w:lsdException w:name="Grid Table 5 Dark Accent 6" w:uiPriority="50"/>
+    <w:lsdException w:name="Grid Table 6 Colorful Accent 6" w:uiPriority="51"/>
+    <w:lsdException w:name="Grid Table 7 Colorful Accent 6" w:uiPriority="52"/>
+    <w:lsdException w:name="List Table 1 Light" w:uiPriority="46"/>
+    <w:lsdException w:name="List Table 2" w:uiPriority="47"/>
+    <w:lsdException w:name="List Table 3" w:uiPriority="48"/>
+    <w:lsdException w:name="List Table 4" w:uiPriority="49"/>
+    <w:lsdException w:name="List Table 5 Dark" w:uiPriority="50"/>
+    <w:lsdException w:name="List Table 6 Colorful" w:uiPriority="51"/>
+    <w:lsdException w:name="List Table 7 Colorful" w:uiPriority="52"/>
+    <w:lsdException w:name="List Table 1 Light Accent 1" w:uiPriority="46"/>
+    <w:lsdException w:name="List Table 2 Accent 1" w:uiPriority="47"/>
+    <w:lsdException w:name="List Table 3 Accent 1" w:uiPriority="48"/>
+    <w:lsdException w:name="List Table 4 Accent 1" w:uiPriority="49"/>
+    <w:lsdException w:name="List Table 5 Dark Accent 1" w:uiPriority="50"/>
+    <w:lsdException w:name="List Table 6 Colorful Accent 1" w:uiPriority="51"/>
+    <w:lsdException w:name="List Table 7 Colorful Accent 1" w:uiPriority="52"/>
+    <w:lsdException w:name="List Table 1 Light Accent 2" w:uiPriority="46"/>
+    <w:lsdException w:name="List Table 2 Accent 2" w:uiPriority="47"/>
+    <w:lsdException w:name="List Table 3 Accent 2" w:uiPriority="48"/>
+    <w:lsdException w:name="List Table 4 Accent 2" w:uiPriority="49"/>
+    <w:lsdException w:name="List Table 5 Dark Accent 2" w:uiPriority="50"/>
+    <w:lsdException w:name="List Table 6 Colorful Accent 2" w:uiPriority="51"/>
+    <w:lsdException w:name="List Table 7 Colorful Accent 2" w:uiPriority="52"/>
+    <w:lsdException w:name="List Table 1 Light Accent 3" w:uiPriority="46"/>
+    <w:lsdException w:name="List Table 2 Accent 3" w:uiPriority="47"/>
+    <w:lsdException w:name="List Table 3 Accent 3" w:uiPriority="48"/>
+    <w:lsdException w:name="List Table 4 Accent 3" w:uiPriority="49"/>
+    <w:lsdException w:name="List Table 5 Dark Accent 3" w:uiPriority="50"/>
+    <w:lsdException w:name="List Table 6 Colorful Accent 3" w:uiPriority="51"/>
+    <w:lsdException w:name="List Table 7 Colorful Accent 3" w:uiPriority="52"/>
+    <w:lsdException w:name="List Table 1 Light Accent 4" w:uiPriority="46"/>
+    <w:lsdException w:name="List Table 2 Accent 4" w:uiPriority="47"/>
+    <w:lsdException w:name="List Table 3 Accent 4" w:uiPriority="48"/>
+    <w:lsdException w:name="List Table 4 Accent 4" w:uiPriority="49"/>
+    <w:lsdException w:name="List Table 5 Dark Accent 4" w:uiPriority="50"/>
+    <w:lsdException w:name="List Table 6 Colorful Accent 4" w:uiPriority="51"/>
+    <w:lsdException w:name="List Table 7 Colorful Accent 4" w:uiPriority="52"/>
+    <w:lsdException w:name="List Table 1 Light Accent 5" w:uiPriority="46"/>
+    <w:lsdException w:name="List Table 2 Accent 5" w:uiPriority="47"/>
+    <w:lsdException w:name="List Table 3 Accent 5" w:uiPriority="48"/>
+    <w:lsdException w:name="List Table 4 Accent 5" w:uiPriority="49"/>
+    <w:lsdException w:name="List Table 5 Dark Accent 5" w:uiPriority="50"/>
+    <w:lsdException w:name="List Table 6 Colorful Accent 5" w:uiPriority="51"/>
+    <w:lsdException w:name="List Table 7 Colorful Accent 5" w:uiPriority="52"/>
+    <w:lsdException w:name="List Table 1 Light Accent 6" w:uiPriority="46"/>
+    <w:lsdException w:name="List Table 2 Accent 6" w:uiPriority="47"/>
+    <w:lsdException w:name="List Table 3 Accent 6" w:uiPriority="48"/>
+    <w:lsdException w:name="List Table 4 Accent 6" w:uiPriority="49"/>
+    <w:lsdException w:name="List Table 5 Dark Accent 6" w:uiPriority="50"/>
+    <w:lsdException w:name="List Table 6 Colorful Accent 6" w:uiPriority="51"/>
+    <w:lsdException w:name="List Table 7 Colorful Accent 6" w:uiPriority="52"/>
   </w:latentStyles>
   <w:style w:type="paragraph" w:default="1" w:styleId="Normal">
     <w:name w:val="Normal"/>
@@ -3344,7 +3049,7 @@
 </file>
 
 <file path=customXml/itemProps1.xml><?xml version="1.0" encoding="utf-8"?>
-<ds:datastoreItem xmlns:ds="http://schemas.openxmlformats.org/officeDocument/2006/customXml" ds:itemID="{F8476F50-C48C-4A25-B6AC-F9423C0D33AF}">
+<ds:datastoreItem xmlns:ds="http://schemas.openxmlformats.org/officeDocument/2006/customXml" ds:itemID="{2899619F-2C2A-4D95-80EC-4C3BC709C1F1}">
   <ds:schemaRefs>
     <ds:schemaRef ds:uri="http://schemas.openxmlformats.org/officeDocument/2006/bibliography"/>
   </ds:schemaRefs>

</xml_diff>